<commit_message>
Tutorial and Security everywhere completed
</commit_message>
<xml_diff>
--- a/Portfolio/COMP6841_Week_5.docx
+++ b/Portfolio/COMP6841_Week_5.docx
@@ -91,6 +91,7 @@
           <w:color w:val="000000" w:themeColor="text1"/>
         </w:rPr>
       </w:pPr>
+      <w:proofErr w:type="gramStart"/>
       <w:r>
         <w:rPr>
           <w:rFonts w:ascii="Aptos" w:eastAsia="Aptos" w:hAnsi="Aptos" w:cs="Aptos"/>
@@ -107,7 +108,17 @@
           <w:bCs/>
           <w:color w:val="000000" w:themeColor="text1"/>
         </w:rPr>
-        <w:t>z5425064</w:t>
+        <w:t>z</w:t>
+      </w:r>
+      <w:proofErr w:type="gramEnd"/>
+      <w:r>
+        <w:rPr>
+          <w:rFonts w:ascii="Aptos" w:eastAsia="Aptos" w:hAnsi="Aptos" w:cs="Aptos"/>
+          <w:b/>
+          <w:bCs/>
+          <w:color w:val="000000" w:themeColor="text1"/>
+        </w:rPr>
+        <w:t>5425064</w:t>
       </w:r>
       <w:r>
         <w:rPr>
@@ -143,7 +154,34 @@
           <w:bCs/>
           <w:color w:val="000000" w:themeColor="text1"/>
         </w:rPr>
-        <w:t>02/07/26</w:t>
+        <w:t xml:space="preserve"> </w:t>
+      </w:r>
+      <w:r>
+        <w:rPr>
+          <w:rFonts w:ascii="Aptos" w:eastAsia="Aptos" w:hAnsi="Aptos" w:cs="Aptos"/>
+          <w:b/>
+          <w:bCs/>
+          <w:color w:val="000000" w:themeColor="text1"/>
+        </w:rPr>
+        <w:t>0</w:t>
+      </w:r>
+      <w:r>
+        <w:rPr>
+          <w:rFonts w:ascii="Aptos" w:eastAsia="Aptos" w:hAnsi="Aptos" w:cs="Aptos"/>
+          <w:b/>
+          <w:bCs/>
+          <w:color w:val="000000" w:themeColor="text1"/>
+        </w:rPr>
+        <w:t>6</w:t>
+      </w:r>
+      <w:r>
+        <w:rPr>
+          <w:rFonts w:ascii="Aptos" w:eastAsia="Aptos" w:hAnsi="Aptos" w:cs="Aptos"/>
+          <w:b/>
+          <w:bCs/>
+          <w:color w:val="000000" w:themeColor="text1"/>
+        </w:rPr>
+        <w:t>/07/26</w:t>
       </w:r>
     </w:p>
     <w:p>
@@ -203,17 +241,757 @@
             <w:tcW w:w="9360" w:type="dxa"/>
           </w:tcPr>
           <w:p/>
+          <w:p>
+            <w:r>
+              <w:rPr>
+                <w:b/>
+                <w:bCs/>
+              </w:rPr>
+              <w:t>Federated Learning and Privacy</w:t>
+            </w:r>
+          </w:p>
+          <w:p>
+            <w:r>
+              <w:t xml:space="preserve">This week’s </w:t>
+            </w:r>
+            <w:r>
+              <w:t>discussion of</w:t>
+            </w:r>
+            <w:r>
+              <w:t xml:space="preserve"> privacy </w:t>
+            </w:r>
+            <w:r>
+              <w:t>prompted</w:t>
+            </w:r>
+            <w:r>
+              <w:t xml:space="preserve"> me to revisit </w:t>
+            </w:r>
+            <w:r>
+              <w:t xml:space="preserve">federated learning, </w:t>
+            </w:r>
+            <w:r>
+              <w:t>a technology I had previously researched</w:t>
+            </w:r>
+            <w:r>
+              <w:t>.</w:t>
+            </w:r>
+            <w:r>
+              <w:t xml:space="preserve"> Federated learning is a </w:t>
+            </w:r>
+            <w:r>
+              <w:t>distributed</w:t>
+            </w:r>
+            <w:r>
+              <w:t xml:space="preserve"> machine-learning approach </w:t>
+            </w:r>
+            <w:r>
+              <w:t>where</w:t>
+            </w:r>
+            <w:r>
+              <w:t xml:space="preserve"> each device </w:t>
+            </w:r>
+            <w:r>
+              <w:t xml:space="preserve">trains a local model </w:t>
+            </w:r>
+            <w:r>
+              <w:t>using its own data, rather than</w:t>
+            </w:r>
+            <w:r>
+              <w:t xml:space="preserve"> sending </w:t>
+            </w:r>
+            <w:r>
+              <w:t xml:space="preserve">raw data to a central server. </w:t>
+            </w:r>
+            <w:r>
+              <w:t>Only the resulting</w:t>
+            </w:r>
+            <w:r>
+              <w:t xml:space="preserve"> model updates are </w:t>
+            </w:r>
+            <w:r>
+              <w:t>shared and combined</w:t>
+            </w:r>
+            <w:r>
+              <w:t xml:space="preserve"> with updates from other clients.</w:t>
+            </w:r>
+          </w:p>
+          <w:p>
+            <w:pPr>
+              <w:rPr>
+                <w:kern w:val="2"/>
+                <w:lang w:val="en-AU" w:eastAsia="en-AU"/>
+                <w14:ligatures w14:val="standardContextual"/>
+              </w:rPr>
+            </w:pPr>
+            <w:r>
+              <w:rPr>
+                <w:b/>
+                <w:bCs/>
+              </w:rPr>
+              <w:t>Privacy Benefits</w:t>
+            </w:r>
+          </w:p>
+          <w:p>
+            <w:r>
+              <w:t>Its main</w:t>
+            </w:r>
+            <w:r>
+              <w:t xml:space="preserve"> privacy </w:t>
+            </w:r>
+            <w:r>
+              <w:t xml:space="preserve">benefit </w:t>
+            </w:r>
+            <w:r>
+              <w:t xml:space="preserve">is that </w:t>
+            </w:r>
+            <w:r>
+              <w:t>raw</w:t>
+            </w:r>
+            <w:r>
+              <w:t xml:space="preserve"> data </w:t>
+            </w:r>
+            <w:r>
+              <w:t>stays on</w:t>
+            </w:r>
+            <w:r>
+              <w:t xml:space="preserve"> the edge device or client. </w:t>
+            </w:r>
+            <w:r>
+              <w:t>Privacy</w:t>
+            </w:r>
+            <w:r>
+              <w:t xml:space="preserve">-preserving </w:t>
+            </w:r>
+            <w:r>
+              <w:t>techniques</w:t>
+            </w:r>
+            <w:r>
+              <w:t xml:space="preserve">, such as differential privacy, can also be applied to model updates before they are </w:t>
+            </w:r>
+            <w:r>
+              <w:t>shared, lowering</w:t>
+            </w:r>
+            <w:r>
+              <w:t xml:space="preserve"> the risk </w:t>
+            </w:r>
+            <w:r>
+              <w:t>that</w:t>
+            </w:r>
+            <w:r>
+              <w:t xml:space="preserve"> sensitive information</w:t>
+            </w:r>
+            <w:r>
+              <w:t xml:space="preserve"> could be reconstructed. As a result,</w:t>
+            </w:r>
+            <w:r>
+              <w:t xml:space="preserve"> a global model </w:t>
+            </w:r>
+            <w:r>
+              <w:t xml:space="preserve">can learn </w:t>
+            </w:r>
+            <w:r>
+              <w:t xml:space="preserve">from </w:t>
+            </w:r>
+            <w:r>
+              <w:t xml:space="preserve">many devices without </w:t>
+            </w:r>
+            <w:r>
+              <w:t xml:space="preserve">relying on a </w:t>
+            </w:r>
+            <w:proofErr w:type="spellStart"/>
+            <w:r>
+              <w:t>centralised</w:t>
+            </w:r>
+            <w:proofErr w:type="spellEnd"/>
+            <w:r>
+              <w:t xml:space="preserve"> store of sensitive data.</w:t>
+            </w:r>
+          </w:p>
+          <w:p>
+            <w:pPr>
+              <w:rPr>
+                <w:kern w:val="2"/>
+                <w:lang w:val="en-AU" w:eastAsia="en-AU"/>
+                <w14:ligatures w14:val="standardContextual"/>
+              </w:rPr>
+            </w:pPr>
+            <w:r>
+              <w:rPr>
+                <w:b/>
+                <w:bCs/>
+              </w:rPr>
+              <w:t>Industry Development</w:t>
+            </w:r>
+          </w:p>
+          <w:p>
+            <w:r>
+              <w:t>Federated</w:t>
+            </w:r>
+            <w:r>
+              <w:t xml:space="preserve"> learning ecosystems are </w:t>
+            </w:r>
+            <w:r>
+              <w:t>now emerging</w:t>
+            </w:r>
+            <w:r>
+              <w:t>, including industry-</w:t>
+            </w:r>
+            <w:r>
+              <w:t>focused</w:t>
+            </w:r>
+            <w:r>
+              <w:t xml:space="preserve"> platforms such as NVIDIA FLARE. </w:t>
+            </w:r>
+            <w:r>
+              <w:t>Its</w:t>
+            </w:r>
+            <w:r>
+              <w:t xml:space="preserve"> commercial </w:t>
+            </w:r>
+            <w:r>
+              <w:t>use suggests</w:t>
+            </w:r>
+            <w:r>
+              <w:t xml:space="preserve"> that federated learning is moving </w:t>
+            </w:r>
+            <w:r>
+              <w:t>from</w:t>
+            </w:r>
+            <w:r>
+              <w:t xml:space="preserve"> research </w:t>
+            </w:r>
+            <w:r>
+              <w:t xml:space="preserve">into practical </w:t>
+            </w:r>
+            <w:r>
+              <w:t>deployment</w:t>
+            </w:r>
+            <w:r>
+              <w:t>.</w:t>
+            </w:r>
+          </w:p>
+          <w:p>
+            <w:pPr>
+              <w:rPr>
+                <w:kern w:val="2"/>
+                <w:lang w:val="en-AU" w:eastAsia="en-AU"/>
+                <w14:ligatures w14:val="standardContextual"/>
+              </w:rPr>
+            </w:pPr>
+            <w:r>
+              <w:rPr>
+                <w:b/>
+                <w:bCs/>
+              </w:rPr>
+              <w:t>Relevant Applications</w:t>
+            </w:r>
+          </w:p>
+          <w:p>
+            <w:pPr>
+              <w:pStyle w:val="ListParagraph"/>
+              <w:numPr>
+                <w:ilvl w:val="0"/>
+                <w:numId w:val="7"/>
+              </w:numPr>
+              <w:spacing w:after="160" w:line="279" w:lineRule="auto"/>
+            </w:pPr>
+            <w:r>
+              <w:rPr>
+                <w:b/>
+                <w:bCs/>
+              </w:rPr>
+              <w:t>Medical imaging and clinical trials:</w:t>
+            </w:r>
+            <w:r>
+              <w:t xml:space="preserve"> </w:t>
+            </w:r>
+            <w:r>
+              <w:t xml:space="preserve">Sharing patient </w:t>
+            </w:r>
+            <w:r>
+              <w:t>data creates clear</w:t>
+            </w:r>
+            <w:r>
+              <w:t xml:space="preserve"> privacy </w:t>
+            </w:r>
+            <w:r>
+              <w:t>risks.</w:t>
+            </w:r>
+            <w:r>
+              <w:t xml:space="preserve"> Federated learning can </w:t>
+            </w:r>
+            <w:r>
+              <w:t>reduce these risks</w:t>
+            </w:r>
+            <w:r>
+              <w:t xml:space="preserve"> by allowing </w:t>
+            </w:r>
+            <w:r>
+              <w:t xml:space="preserve">hospitals </w:t>
+            </w:r>
+            <w:r>
+              <w:t xml:space="preserve">to train models </w:t>
+            </w:r>
+            <w:r>
+              <w:t xml:space="preserve">locally </w:t>
+            </w:r>
+            <w:r>
+              <w:t xml:space="preserve">without </w:t>
+            </w:r>
+            <w:proofErr w:type="spellStart"/>
+            <w:r>
+              <w:t>centralising</w:t>
+            </w:r>
+            <w:proofErr w:type="spellEnd"/>
+            <w:r>
+              <w:t xml:space="preserve"> patient </w:t>
+            </w:r>
+            <w:r>
+              <w:t>records.</w:t>
+            </w:r>
+            <w:r>
+              <w:t xml:space="preserve"> This is </w:t>
+            </w:r>
+            <w:r>
+              <w:t xml:space="preserve">useful because hospitals often </w:t>
+            </w:r>
+            <w:r>
+              <w:t>manage records differently</w:t>
+            </w:r>
+            <w:r>
+              <w:t xml:space="preserve"> and </w:t>
+            </w:r>
+            <w:r>
+              <w:t xml:space="preserve">may </w:t>
+            </w:r>
+            <w:r>
+              <w:t xml:space="preserve">use </w:t>
+            </w:r>
+            <w:r>
+              <w:t>incompatible</w:t>
+            </w:r>
+            <w:r>
+              <w:t xml:space="preserve"> systems</w:t>
+            </w:r>
+            <w:r>
+              <w:t>, so local training allows</w:t>
+            </w:r>
+            <w:r>
+              <w:t xml:space="preserve"> models </w:t>
+            </w:r>
+            <w:r>
+              <w:t xml:space="preserve">to adapt to </w:t>
+            </w:r>
+            <w:r>
+              <w:t xml:space="preserve">each </w:t>
+            </w:r>
+            <w:r>
+              <w:t xml:space="preserve">facility’s </w:t>
+            </w:r>
+            <w:r>
+              <w:t>data structure</w:t>
+            </w:r>
+            <w:r>
+              <w:t>.</w:t>
+            </w:r>
+          </w:p>
+          <w:p>
+            <w:pPr>
+              <w:pStyle w:val="ListParagraph"/>
+              <w:numPr>
+                <w:ilvl w:val="0"/>
+                <w:numId w:val="7"/>
+              </w:numPr>
+              <w:spacing w:after="160" w:line="279" w:lineRule="auto"/>
+            </w:pPr>
+            <w:r>
+              <w:rPr>
+                <w:b/>
+                <w:bCs/>
+              </w:rPr>
+              <w:t>Fraud detection:</w:t>
+            </w:r>
+            <w:r>
+              <w:t xml:space="preserve"> Financial institutions are often </w:t>
+            </w:r>
+            <w:r>
+              <w:t>hesitant</w:t>
+            </w:r>
+            <w:r>
+              <w:t xml:space="preserve"> to share fraud</w:t>
+            </w:r>
+            <w:r>
+              <w:t xml:space="preserve"> data because it is commercially and legally sensitive. </w:t>
+            </w:r>
+            <w:r>
+              <w:t xml:space="preserve">Yet effective fraud detection models </w:t>
+            </w:r>
+            <w:r>
+              <w:t>need large</w:t>
+            </w:r>
+            <w:r>
+              <w:t>,</w:t>
+            </w:r>
+            <w:r>
+              <w:t xml:space="preserve"> varied datasets</w:t>
+            </w:r>
+            <w:r>
+              <w:t xml:space="preserve">, while individual institutions may only </w:t>
+            </w:r>
+            <w:r>
+              <w:t>see</w:t>
+            </w:r>
+            <w:r>
+              <w:t xml:space="preserve"> a limited number of recent </w:t>
+            </w:r>
+            <w:r>
+              <w:t xml:space="preserve">cases. Federated learning </w:t>
+            </w:r>
+            <w:r>
+              <w:t>provides</w:t>
+            </w:r>
+            <w:r>
+              <w:t xml:space="preserve"> a compromise</w:t>
+            </w:r>
+            <w:r>
+              <w:t xml:space="preserve"> by allowing</w:t>
+            </w:r>
+            <w:r>
+              <w:t xml:space="preserve"> institutions </w:t>
+            </w:r>
+            <w:r>
+              <w:t xml:space="preserve">to </w:t>
+            </w:r>
+            <w:r>
+              <w:t xml:space="preserve">improve </w:t>
+            </w:r>
+            <w:r>
+              <w:t xml:space="preserve">shared models </w:t>
+            </w:r>
+            <w:r>
+              <w:t xml:space="preserve">without directly </w:t>
+            </w:r>
+            <w:r>
+              <w:t>exposing their</w:t>
+            </w:r>
+            <w:r>
+              <w:t xml:space="preserve"> underlying </w:t>
+            </w:r>
+            <w:r>
+              <w:t>data.</w:t>
+            </w:r>
+          </w:p>
+          <w:p>
+            <w:pPr>
+              <w:pStyle w:val="ListParagraph"/>
+              <w:numPr>
+                <w:ilvl w:val="0"/>
+                <w:numId w:val="7"/>
+              </w:numPr>
+              <w:spacing w:after="160" w:line="279" w:lineRule="auto"/>
+            </w:pPr>
+            <w:r>
+              <w:rPr>
+                <w:noProof/>
+              </w:rPr>
+              <w:lastRenderedPageBreak/>
+              <w:drawing>
+                <wp:anchor distT="0" distB="0" distL="114300" distR="114300" simplePos="0" relativeHeight="251658240" behindDoc="0" locked="0" layoutInCell="1" allowOverlap="1" wp14:anchorId="795BAC81" wp14:editId="4C9B877C">
+                  <wp:simplePos x="0" y="0"/>
+                  <wp:positionH relativeFrom="column">
+                    <wp:posOffset>635</wp:posOffset>
+                  </wp:positionH>
+                  <wp:positionV relativeFrom="paragraph">
+                    <wp:posOffset>1161006</wp:posOffset>
+                  </wp:positionV>
+                  <wp:extent cx="3671558" cy="2009996"/>
+                  <wp:effectExtent l="0" t="0" r="5715" b="0"/>
+                  <wp:wrapSquare wrapText="bothSides"/>
+                  <wp:docPr id="265968209" name="Picture 1"/>
+                  <wp:cNvGraphicFramePr>
+                    <a:graphicFrameLocks xmlns:a="http://schemas.openxmlformats.org/drawingml/2006/main" noChangeAspect="1"/>
+                  </wp:cNvGraphicFramePr>
+                  <a:graphic xmlns:a="http://schemas.openxmlformats.org/drawingml/2006/main">
+                    <a:graphicData uri="http://schemas.openxmlformats.org/drawingml/2006/picture">
+                      <pic:pic xmlns:pic="http://schemas.openxmlformats.org/drawingml/2006/picture">
+                        <pic:nvPicPr>
+                          <pic:cNvPr id="0" name="Picture 2"/>
+                          <pic:cNvPicPr>
+                            <a:picLocks noChangeAspect="1" noChangeArrowheads="1"/>
+                          </pic:cNvPicPr>
+                        </pic:nvPicPr>
+                        <pic:blipFill>
+                          <a:blip r:embed="rId6" cstate="print">
+                            <a:extLst>
+                              <a:ext uri="{28A0092B-C50C-407E-A947-70E740481C1C}">
+                                <a14:useLocalDpi xmlns:a14="http://schemas.microsoft.com/office/drawing/2010/main" val="0"/>
+                              </a:ext>
+                            </a:extLst>
+                          </a:blip>
+                          <a:srcRect/>
+                          <a:stretch>
+                            <a:fillRect/>
+                          </a:stretch>
+                        </pic:blipFill>
+                        <pic:spPr bwMode="auto">
+                          <a:xfrm>
+                            <a:off x="0" y="0"/>
+                            <a:ext cx="3671558" cy="2009996"/>
+                          </a:xfrm>
+                          <a:prstGeom prst="rect">
+                            <a:avLst/>
+                          </a:prstGeom>
+                          <a:noFill/>
+                        </pic:spPr>
+                      </pic:pic>
+                    </a:graphicData>
+                  </a:graphic>
+                </wp:anchor>
+              </w:drawing>
+            </w:r>
+            <w:r>
+              <w:rPr>
+                <w:b/>
+                <w:bCs/>
+              </w:rPr>
+              <w:t>Google predictive keyboard:</w:t>
+            </w:r>
+            <w:r>
+              <w:t xml:space="preserve"> Predictive keyboards </w:t>
+            </w:r>
+            <w:r>
+              <w:t>depend</w:t>
+            </w:r>
+            <w:r>
+              <w:t xml:space="preserve"> on user input patterns</w:t>
+            </w:r>
+            <w:r>
+              <w:t xml:space="preserve">, but keystroke data </w:t>
+            </w:r>
+            <w:proofErr w:type="gramStart"/>
+            <w:r>
+              <w:t>is</w:t>
+            </w:r>
+            <w:proofErr w:type="gramEnd"/>
+            <w:r>
+              <w:t xml:space="preserve"> highly sensitive and risky to store centrally. Federated learning </w:t>
+            </w:r>
+            <w:r>
+              <w:t>addresses</w:t>
+            </w:r>
+            <w:r>
+              <w:t xml:space="preserve"> this by training a </w:t>
+            </w:r>
+            <w:r>
+              <w:t>shared</w:t>
+            </w:r>
+            <w:r>
+              <w:t xml:space="preserve"> model across devices</w:t>
+            </w:r>
+            <w:r>
+              <w:t>,</w:t>
+            </w:r>
+            <w:r>
+              <w:t xml:space="preserve"> then </w:t>
+            </w:r>
+            <w:proofErr w:type="spellStart"/>
+            <w:r>
+              <w:t>personalising</w:t>
+            </w:r>
+            <w:proofErr w:type="spellEnd"/>
+            <w:r>
+              <w:t xml:space="preserve"> it for individual users without </w:t>
+            </w:r>
+            <w:r>
+              <w:t>collecting</w:t>
+            </w:r>
+            <w:r>
+              <w:t xml:space="preserve"> raw keystroke data </w:t>
+            </w:r>
+            <w:r>
+              <w:t xml:space="preserve">in one </w:t>
+            </w:r>
+            <w:r>
+              <w:t>place</w:t>
+            </w:r>
+            <w:r>
+              <w:t>.</w:t>
+            </w:r>
+          </w:p>
+          <w:p/>
+          <w:p>
+            <w:r>
+              <w:t>Federated</w:t>
+            </w:r>
+            <w:r>
+              <w:t xml:space="preserve"> learning also </w:t>
+            </w:r>
+            <w:r>
+              <w:t>introduces</w:t>
+            </w:r>
+            <w:r>
+              <w:t xml:space="preserve"> risks. </w:t>
+            </w:r>
+            <w:r>
+              <w:t>Like encryption and anonymity tools, it can support legitimate privacy but may also be misused. An attacker could use</w:t>
+            </w:r>
+            <w:r>
+              <w:t xml:space="preserve"> federated learning </w:t>
+            </w:r>
+            <w:r>
+              <w:t xml:space="preserve">to train models </w:t>
+            </w:r>
+            <w:r>
+              <w:t>about</w:t>
+            </w:r>
+            <w:r>
+              <w:t xml:space="preserve"> a target, such as an </w:t>
+            </w:r>
+            <w:proofErr w:type="spellStart"/>
+            <w:r>
+              <w:t>organisation</w:t>
+            </w:r>
+            <w:proofErr w:type="spellEnd"/>
+            <w:r>
+              <w:t xml:space="preserve">, individual, or business, without sending all collected intelligence </w:t>
+            </w:r>
+            <w:r>
+              <w:t xml:space="preserve">to a central location. This could </w:t>
+            </w:r>
+            <w:r>
+              <w:t>lower</w:t>
+            </w:r>
+            <w:r>
+              <w:t xml:space="preserve"> the chance of detection while allowing small, temporary data buffers on compromised devices to support tasks such as gait analysis or voice identification.</w:t>
+            </w:r>
+            <w:r>
+              <w:t xml:space="preserve"> </w:t>
+            </w:r>
+            <w:r>
+              <w:t>Even</w:t>
+            </w:r>
+            <w:r>
+              <w:t xml:space="preserve"> after detectio</w:t>
+            </w:r>
+            <w:r>
+              <w:t>n</w:t>
+            </w:r>
+            <w:r>
+              <w:t>,</w:t>
+            </w:r>
+            <w:r>
+              <w:t xml:space="preserve"> it may </w:t>
+            </w:r>
+            <w:r>
+              <w:t xml:space="preserve">be difficult to </w:t>
+            </w:r>
+            <w:r>
+              <w:t xml:space="preserve">determine what </w:t>
+            </w:r>
+            <w:r>
+              <w:t xml:space="preserve">type of </w:t>
+            </w:r>
+            <w:r>
+              <w:t>model</w:t>
+            </w:r>
+            <w:r>
+              <w:t xml:space="preserve"> </w:t>
+            </w:r>
+            <w:r>
+              <w:t xml:space="preserve">has been </w:t>
+            </w:r>
+            <w:r>
+              <w:t>created or</w:t>
+            </w:r>
+            <w:r>
+              <w:t xml:space="preserve"> stored </w:t>
+            </w:r>
+            <w:r>
+              <w:t>on the attacker’s</w:t>
+            </w:r>
+            <w:r>
+              <w:t xml:space="preserve"> server</w:t>
+            </w:r>
+            <w:r>
+              <w:t xml:space="preserve">, </w:t>
+            </w:r>
+            <w:r>
+              <w:t xml:space="preserve">since </w:t>
+            </w:r>
+            <w:r>
+              <w:t xml:space="preserve">each training </w:t>
+            </w:r>
+            <w:r>
+              <w:t>round</w:t>
+            </w:r>
+            <w:r>
+              <w:t xml:space="preserve"> </w:t>
+            </w:r>
+            <w:r>
+              <w:t>sends updated</w:t>
+            </w:r>
+            <w:r>
+              <w:t xml:space="preserve"> model </w:t>
+            </w:r>
+            <w:r>
+              <w:t xml:space="preserve">information back to that </w:t>
+            </w:r>
+            <w:r>
+              <w:t>server</w:t>
+            </w:r>
+            <w:r>
+              <w:t>. This could leave victims exposed to further misuse.</w:t>
+            </w:r>
+          </w:p>
           <w:p/>
           <w:p/>
-          <w:p/>
-          <w:p/>
-          <w:p/>
-          <w:p/>
-          <w:p/>
+          <w:p>
+            <w:r>
+              <w:t xml:space="preserve">Link: </w:t>
+            </w:r>
+            <w:hyperlink r:id="rId7" w:history="1">
+              <w:r>
+                <w:rPr>
+                  <w:rStyle w:val="Hyperlink"/>
+                </w:rPr>
+                <w:t>https://developer.nvidia.com/flare</w:t>
+              </w:r>
+            </w:hyperlink>
+            <w:r>
+              <w:t xml:space="preserve"> </w:t>
+            </w:r>
+          </w:p>
+          <w:p>
+            <w:proofErr w:type="gramStart"/>
+            <w:r>
+              <w:t>Link :</w:t>
+            </w:r>
+            <w:proofErr w:type="gramEnd"/>
+            <w:r>
+              <w:t xml:space="preserve"> </w:t>
+            </w:r>
+            <w:hyperlink r:id="rId8" w:history="1">
+              <w:r>
+                <w:rPr>
+                  <w:rStyle w:val="Hyperlink"/>
+                </w:rPr>
+                <w:t>https://research.google/pubs/federated-learning-for-mobile-keyboard-prediction-2/</w:t>
+              </w:r>
+            </w:hyperlink>
+            <w:r>
+              <w:t xml:space="preserve"> </w:t>
+            </w:r>
+          </w:p>
           <w:p/>
         </w:tc>
       </w:tr>
     </w:tbl>
+    <w:p/>
+    <w:p>
+      <w:r>
+        <w:br w:type="page"/>
+      </w:r>
+    </w:p>
     <w:p/>
     <w:p>
       <w:pPr>
@@ -241,7 +1019,7 @@
         <w:pStyle w:val="Heading2"/>
         <w:spacing w:before="0" w:after="160"/>
       </w:pPr>
-      <w:hyperlink r:id="rId6">
+      <w:hyperlink r:id="rId9">
         <w:r>
           <w:rPr>
             <w:rStyle w:val="Hyperlink"/>
@@ -299,7 +1077,7 @@
         <w:pStyle w:val="Heading2"/>
         <w:spacing w:before="0" w:after="160"/>
       </w:pPr>
-      <w:hyperlink r:id="rId7">
+      <w:hyperlink r:id="rId10">
         <w:r>
           <w:rPr>
             <w:rStyle w:val="Hyperlink"/>
@@ -355,7 +1133,7 @@
         <w:pStyle w:val="Heading2"/>
         <w:spacing w:before="0" w:after="160"/>
       </w:pPr>
-      <w:hyperlink r:id="rId8">
+      <w:hyperlink r:id="rId11">
         <w:r>
           <w:rPr>
             <w:rStyle w:val="Hyperlink"/>
@@ -439,7 +1217,7 @@
           <w:szCs w:val="32"/>
         </w:rPr>
       </w:pPr>
-      <w:hyperlink r:id="rId9">
+      <w:hyperlink r:id="rId12">
         <w:r>
           <w:rPr>
             <w:rStyle w:val="Hyperlink"/>
@@ -495,7 +1273,6 @@
           <w:b/>
           <w:bCs/>
         </w:rPr>
-        <w:lastRenderedPageBreak/>
         <w:t>Analysis and Reflection</w:t>
       </w:r>
     </w:p>
@@ -503,7 +1280,7 @@
       <w:pPr>
         <w:pStyle w:val="Heading2"/>
       </w:pPr>
-      <w:hyperlink r:id="rId10">
+      <w:hyperlink r:id="rId13">
         <w:r>
           <w:rPr>
             <w:rStyle w:val="Hyperlink"/>
@@ -538,7 +1315,39 @@
           <w:p/>
           <w:p>
             <w:r>
-              <w:t>During this weeks tutorial discussion we primarily discussed the topic of privacy and data collection in Australia. We had to have a debate regarding whether ever person in Australia could have all of their data collected by governments. I was an adjudicator of the debate and hence was able to here both sides.</w:t>
+              <w:t xml:space="preserve">During this </w:t>
+            </w:r>
+            <w:proofErr w:type="gramStart"/>
+            <w:r>
+              <w:t>weeks</w:t>
+            </w:r>
+            <w:proofErr w:type="gramEnd"/>
+            <w:r>
+              <w:t xml:space="preserve"> tutorial </w:t>
+            </w:r>
+            <w:proofErr w:type="gramStart"/>
+            <w:r>
+              <w:t>discussion</w:t>
+            </w:r>
+            <w:proofErr w:type="gramEnd"/>
+            <w:r>
+              <w:t xml:space="preserve"> we primarily discussed the topic of privacy and data collection in Australia. We had to have a debate regarding whether ever person in Australia could have </w:t>
+            </w:r>
+            <w:proofErr w:type="gramStart"/>
+            <w:r>
+              <w:t>all of</w:t>
+            </w:r>
+            <w:proofErr w:type="gramEnd"/>
+            <w:r>
+              <w:t xml:space="preserve"> their data collected by governments. I was an adjudicator of the debate and hence was able to </w:t>
+            </w:r>
+            <w:proofErr w:type="gramStart"/>
+            <w:r>
+              <w:t>here</w:t>
+            </w:r>
+            <w:proofErr w:type="gramEnd"/>
+            <w:r>
+              <w:t xml:space="preserve"> both sides.</w:t>
             </w:r>
             <w:r>
               <w:t xml:space="preserve"> There were many points I agreed and disagreed</w:t>
@@ -567,6 +1376,7 @@
                 <w:u w:val="single"/>
               </w:rPr>
             </w:pPr>
+            <w:proofErr w:type="gramStart"/>
             <w:r>
               <w:rPr>
                 <w:b/>
@@ -575,6 +1385,7 @@
               </w:rPr>
               <w:t>For :</w:t>
             </w:r>
+            <w:proofErr w:type="gramEnd"/>
           </w:p>
           <w:p>
             <w:pPr>
@@ -586,13 +1397,7 @@
               <w:spacing w:after="160" w:line="279" w:lineRule="auto"/>
             </w:pPr>
             <w:r>
-              <w:t>Data c</w:t>
-            </w:r>
-            <w:r>
-              <w:t>oll</w:t>
-            </w:r>
-            <w:r>
-              <w:t xml:space="preserve">ection can </w:t>
+              <w:t xml:space="preserve">Data collection can </w:t>
             </w:r>
             <w:r>
               <w:t>help identify threats</w:t>
@@ -604,10 +1409,7 @@
               <w:t>create</w:t>
             </w:r>
             <w:r>
-              <w:t xml:space="preserve"> his</w:t>
-            </w:r>
-            <w:r>
-              <w:t xml:space="preserve">torical </w:t>
+              <w:t xml:space="preserve"> historical </w:t>
             </w:r>
             <w:r>
               <w:t xml:space="preserve">records for future </w:t>
@@ -619,13 +1421,7 @@
               <w:t xml:space="preserve">review, especially as </w:t>
             </w:r>
             <w:r>
-              <w:t xml:space="preserve">analytical tools </w:t>
-            </w:r>
-            <w:r>
-              <w:t>imp</w:t>
-            </w:r>
-            <w:r>
-              <w:t xml:space="preserve">rove. </w:t>
+              <w:t xml:space="preserve">analytical tools improve. </w:t>
             </w:r>
             <w:r>
               <w:t>This could benefit society by enabling future generations to test new solutions, refine strategies, and learn from past mistakes, even where the current generation cannot.</w:t>
@@ -657,7 +1453,15 @@
               </w:numPr>
             </w:pPr>
             <w:r>
-              <w:t>Not all should be collected because how could the security and safety of people in roles such as intelligent operatives and undercover police workers remain safe and effective with such knowledge collected about them. This would create a critical flaw and a new attack vector.</w:t>
+              <w:t xml:space="preserve">Not all should be collected because how could the security and safety of people in roles such as intelligent operatives and undercover police workers remain safe and effective with </w:t>
+            </w:r>
+            <w:proofErr w:type="gramStart"/>
+            <w:r>
+              <w:t>such</w:t>
+            </w:r>
+            <w:proofErr w:type="gramEnd"/>
+            <w:r>
+              <w:t xml:space="preserve"> knowledge collected about them. This would create a critical flaw and a new attack vector.</w:t>
             </w:r>
           </w:p>
           <w:p>
@@ -669,6 +1473,7 @@
               </w:numPr>
             </w:pPr>
             <w:r>
+              <w:lastRenderedPageBreak/>
               <w:t xml:space="preserve">Future governments cannot be trusted. </w:t>
             </w:r>
             <w:r>
@@ -716,7 +1521,23 @@
               </w:numPr>
             </w:pPr>
             <w:r>
-              <w:t>There is very little practical methods where the data of a criminal can be captured before the crime. Whilst I mostly agreed with this point, I disagreed with the fact that there are methods that can capture a lot of criminal from pattern matching methods. This could be where data is collected once the criminal falls within a confidence interval of prediction to commit future crimes (</w:t>
+              <w:t xml:space="preserve">There </w:t>
+            </w:r>
+            <w:proofErr w:type="gramStart"/>
+            <w:r>
+              <w:t>is</w:t>
+            </w:r>
+            <w:proofErr w:type="gramEnd"/>
+            <w:r>
+              <w:t xml:space="preserve"> very little practical methods where the data of a criminal can be captured before the crime. Whilst I mostly agreed with this point, I disagreed with the fact that there are methods that can capture a lot of </w:t>
+            </w:r>
+            <w:proofErr w:type="gramStart"/>
+            <w:r>
+              <w:t>criminal</w:t>
+            </w:r>
+            <w:proofErr w:type="gramEnd"/>
+            <w:r>
+              <w:t xml:space="preserve"> from pattern matching methods. This could be where data is collected once the criminal falls within a confidence interval of prediction to commit future crimes (</w:t>
             </w:r>
             <w:proofErr w:type="spellStart"/>
             <w:r>
@@ -729,11 +1550,9 @@
             <w:r>
               <w:t xml:space="preserve">a mechanism is questionable, since </w:t>
             </w:r>
-            <w:proofErr w:type="spellStart"/>
-            <w:r>
-              <w:t>their</w:t>
-            </w:r>
-            <w:proofErr w:type="spellEnd"/>
+            <w:r>
+              <w:t>there</w:t>
+            </w:r>
             <w:r>
               <w:t xml:space="preserve"> could also be early intervention taken at that stage.</w:t>
             </w:r>
@@ -760,18 +1579,358 @@
                 <w:ilvl w:val="0"/>
                 <w:numId w:val="4"/>
               </w:numPr>
+              <w:spacing w:after="160" w:line="279" w:lineRule="auto"/>
             </w:pPr>
-            <w:r>
-              <w:t xml:space="preserve">The large amount of people being punished for the minority. </w:t>
+            <w:proofErr w:type="gramStart"/>
+            <w:r>
+              <w:t xml:space="preserve">A </w:t>
+            </w:r>
+            <w:r>
+              <w:t xml:space="preserve">large </w:t>
+            </w:r>
+            <w:r>
+              <w:t>number</w:t>
+            </w:r>
+            <w:r>
+              <w:t xml:space="preserve"> of</w:t>
+            </w:r>
+            <w:proofErr w:type="gramEnd"/>
+            <w:r>
+              <w:t xml:space="preserve"> people </w:t>
+            </w:r>
+            <w:r>
+              <w:t xml:space="preserve">are </w:t>
+            </w:r>
+            <w:r>
+              <w:t>being punished for</w:t>
+            </w:r>
+            <w:r>
+              <w:t xml:space="preserve"> </w:t>
+            </w:r>
+            <w:r>
+              <w:t xml:space="preserve">the </w:t>
+            </w:r>
+            <w:r>
+              <w:t>actions</w:t>
+            </w:r>
+            <w:r>
+              <w:t xml:space="preserve"> of a minority. </w:t>
+            </w:r>
+            <w:r>
+              <w:t xml:space="preserve">I mostly agree </w:t>
+            </w:r>
+            <w:r>
+              <w:t>with this</w:t>
+            </w:r>
+            <w:r>
+              <w:t xml:space="preserve"> point;</w:t>
+            </w:r>
+            <w:r>
+              <w:t xml:space="preserve"> however</w:t>
+            </w:r>
+            <w:r>
+              <w:t>,</w:t>
+            </w:r>
+            <w:r>
+              <w:t xml:space="preserve"> I also </w:t>
+            </w:r>
+            <w:r>
+              <w:t xml:space="preserve">believe </w:t>
+            </w:r>
+            <w:r>
+              <w:t>i</w:t>
+            </w:r>
+            <w:r>
+              <w:t xml:space="preserve">t </w:t>
+            </w:r>
+            <w:r>
+              <w:t>fails</w:t>
+            </w:r>
+            <w:r>
+              <w:t xml:space="preserve"> to </w:t>
+            </w:r>
+            <w:r>
+              <w:t>acknowledge</w:t>
+            </w:r>
+            <w:r>
+              <w:t xml:space="preserve"> </w:t>
+            </w:r>
+            <w:r>
+              <w:t>the exc</w:t>
+            </w:r>
+            <w:r>
+              <w:t xml:space="preserve">hange of </w:t>
+            </w:r>
+            <w:r>
+              <w:t>information</w:t>
+            </w:r>
+            <w:r>
+              <w:t xml:space="preserve"> for </w:t>
+            </w:r>
+            <w:r>
+              <w:t>immediate</w:t>
+            </w:r>
+            <w:r>
+              <w:t xml:space="preserve"> safety. That is</w:t>
+            </w:r>
+            <w:r>
+              <w:t xml:space="preserve">, </w:t>
+            </w:r>
+            <w:r>
+              <w:t xml:space="preserve">the </w:t>
+            </w:r>
+            <w:r>
+              <w:t>vast majorit</w:t>
+            </w:r>
+            <w:r>
+              <w:t xml:space="preserve">y </w:t>
+            </w:r>
+            <w:r>
+              <w:t>would</w:t>
+            </w:r>
+            <w:r>
+              <w:t xml:space="preserve"> be g</w:t>
+            </w:r>
+            <w:r>
+              <w:t xml:space="preserve">iving </w:t>
+            </w:r>
+            <w:r>
+              <w:t xml:space="preserve">up </w:t>
+            </w:r>
+            <w:r>
+              <w:t xml:space="preserve">their information </w:t>
+            </w:r>
+            <w:r>
+              <w:t>to benefit their own safety and reduce crim</w:t>
+            </w:r>
+            <w:r>
+              <w:t xml:space="preserve">e </w:t>
+            </w:r>
+            <w:r>
+              <w:t>around</w:t>
+            </w:r>
+            <w:r>
+              <w:t xml:space="preserve"> them. </w:t>
+            </w:r>
+            <w:r>
+              <w:t xml:space="preserve">I think this </w:t>
+            </w:r>
+            <w:r>
+              <w:t xml:space="preserve">is </w:t>
+            </w:r>
+            <w:r>
+              <w:t>important because it</w:t>
+            </w:r>
+            <w:r>
+              <w:t xml:space="preserve"> </w:t>
+            </w:r>
+            <w:r>
+              <w:t xml:space="preserve">introduces a </w:t>
+            </w:r>
+            <w:r>
+              <w:t>utili</w:t>
+            </w:r>
+            <w:r>
+              <w:t xml:space="preserve">tarian perspective </w:t>
+            </w:r>
+            <w:r>
+              <w:t>on</w:t>
+            </w:r>
+            <w:r>
+              <w:t xml:space="preserve"> </w:t>
+            </w:r>
+            <w:r>
+              <w:t>data collection</w:t>
+            </w:r>
+            <w:r>
+              <w:t>,</w:t>
+            </w:r>
+            <w:r>
+              <w:t xml:space="preserve"> where </w:t>
+            </w:r>
+            <w:r>
+              <w:t xml:space="preserve">it </w:t>
+            </w:r>
+            <w:r>
+              <w:t xml:space="preserve">can </w:t>
+            </w:r>
+            <w:r>
+              <w:t xml:space="preserve">both </w:t>
+            </w:r>
+            <w:r>
+              <w:t xml:space="preserve">benefit </w:t>
+            </w:r>
+            <w:r>
+              <w:t xml:space="preserve">and </w:t>
+            </w:r>
+            <w:r>
+              <w:t>disadvantage</w:t>
+            </w:r>
+            <w:r>
+              <w:t xml:space="preserve"> </w:t>
+            </w:r>
+            <w:r>
+              <w:t>the</w:t>
+            </w:r>
+            <w:r>
+              <w:t xml:space="preserve"> </w:t>
+            </w:r>
+            <w:r>
+              <w:t xml:space="preserve">majority </w:t>
+            </w:r>
+            <w:r>
+              <w:t>because</w:t>
+            </w:r>
+            <w:r>
+              <w:t xml:space="preserve"> of the</w:t>
+            </w:r>
+            <w:r>
+              <w:t xml:space="preserve"> </w:t>
+            </w:r>
+            <w:r>
+              <w:t xml:space="preserve">actions of a </w:t>
+            </w:r>
+            <w:r>
+              <w:t>minority. Th</w:t>
+            </w:r>
+            <w:r>
+              <w:t>er</w:t>
+            </w:r>
+            <w:r>
+              <w:t>efore</w:t>
+            </w:r>
+            <w:r>
+              <w:t xml:space="preserve">, </w:t>
+            </w:r>
+            <w:r>
+              <w:t>I</w:t>
+            </w:r>
+            <w:r>
+              <w:t xml:space="preserve"> </w:t>
+            </w:r>
+            <w:r>
+              <w:t>partially agree that there</w:t>
+            </w:r>
+            <w:r>
+              <w:t xml:space="preserve"> could be an </w:t>
+            </w:r>
+            <w:r>
+              <w:t xml:space="preserve">optimal amount of information </w:t>
+            </w:r>
+            <w:r>
+              <w:t xml:space="preserve">collection that benefits </w:t>
+            </w:r>
+            <w:r>
+              <w:t xml:space="preserve">the collective </w:t>
+            </w:r>
+            <w:r>
+              <w:t>without disadvan</w:t>
+            </w:r>
+            <w:r>
+              <w:t xml:space="preserve">taging </w:t>
+            </w:r>
+            <w:r>
+              <w:t xml:space="preserve">individuals </w:t>
+            </w:r>
+            <w:r>
+              <w:t>to the greate</w:t>
+            </w:r>
+            <w:r>
+              <w:t>st e</w:t>
+            </w:r>
+            <w:r>
+              <w:t>xtent</w:t>
+            </w:r>
+            <w:r>
+              <w:t xml:space="preserve"> </w:t>
+            </w:r>
+            <w:r>
+              <w:t xml:space="preserve">possible </w:t>
+            </w:r>
+            <w:r>
+              <w:t>(</w:t>
+            </w:r>
+            <w:r>
+              <w:t>e.g</w:t>
+            </w:r>
+            <w:r>
+              <w:t>.</w:t>
+            </w:r>
+            <w:r>
+              <w:t xml:space="preserve"> </w:t>
+            </w:r>
+            <w:r>
+              <w:t>focusing da</w:t>
+            </w:r>
+            <w:r>
+              <w:t xml:space="preserve">ta collection </w:t>
+            </w:r>
+            <w:r>
+              <w:t>on</w:t>
+            </w:r>
+            <w:r>
+              <w:t xml:space="preserve"> speci</w:t>
+            </w:r>
+            <w:r>
+              <w:t>fic marke</w:t>
+            </w:r>
+            <w:r>
+              <w:t xml:space="preserve">rs for terrorism </w:t>
+            </w:r>
+            <w:r>
+              <w:t>or violent crime</w:t>
+            </w:r>
+            <w:r>
+              <w:t>, but not for petty t</w:t>
+            </w:r>
+            <w:r>
+              <w:t>heft or</w:t>
+            </w:r>
+            <w:r>
+              <w:t xml:space="preserve"> </w:t>
+            </w:r>
+            <w:r>
+              <w:t>minor</w:t>
+            </w:r>
+            <w:r>
+              <w:t xml:space="preserve"> road offen</w:t>
+            </w:r>
+            <w:r>
+              <w:t>ces</w:t>
+            </w:r>
+            <w:r>
+              <w:t>).</w:t>
             </w:r>
           </w:p>
-          <w:p/>
-          <w:p/>
-          <w:p/>
-          <w:p/>
-          <w:p/>
-          <w:p/>
-          <w:p/>
+          <w:p>
+            <w:r>
+              <w:t xml:space="preserve">After the debate I mostly believed that the debate itself was </w:t>
+            </w:r>
+            <w:proofErr w:type="gramStart"/>
+            <w:r>
+              <w:t>week</w:t>
+            </w:r>
+            <w:proofErr w:type="gramEnd"/>
+            <w:r>
+              <w:t xml:space="preserve"> because neither side clearly defined the bounds of their debate. I found that each argument could have been extended to a more thorough analysis. </w:t>
+            </w:r>
+            <w:proofErr w:type="gramStart"/>
+            <w:r>
+              <w:t>However</w:t>
+            </w:r>
+            <w:proofErr w:type="gramEnd"/>
+            <w:r>
+              <w:t xml:space="preserve"> I found the Against team to be more convincing and </w:t>
+            </w:r>
+            <w:proofErr w:type="gramStart"/>
+            <w:r>
+              <w:t>produce</w:t>
+            </w:r>
+            <w:proofErr w:type="gramEnd"/>
+            <w:r>
+              <w:t xml:space="preserve"> a stronger argument. </w:t>
+            </w:r>
+          </w:p>
         </w:tc>
       </w:tr>
     </w:tbl>
@@ -823,6 +1982,304 @@
 <file path=word/numbering.xml><?xml version="1.0" encoding="utf-8"?>
 <w:numbering xmlns:wpc="http://schemas.microsoft.com/office/word/2010/wordprocessingCanvas" xmlns:cx="http://schemas.microsoft.com/office/drawing/2014/chartex" xmlns:cx1="http://schemas.microsoft.com/office/drawing/2015/9/8/chartex" xmlns:cx2="http://schemas.microsoft.com/office/drawing/2015/10/21/chartex" xmlns:cx3="http://schemas.microsoft.com/office/drawing/2016/5/9/chartex" xmlns:cx4="http://schemas.microsoft.com/office/drawing/2016/5/10/chartex" xmlns:cx5="http://schemas.microsoft.com/office/drawing/2016/5/11/chartex" xmlns:cx6="http://schemas.microsoft.com/office/drawing/2016/5/12/chartex" xmlns:cx7="http://schemas.microsoft.com/office/drawing/2016/5/13/chartex" xmlns:cx8="http://schemas.microsoft.com/office/drawing/2016/5/14/chartex" xmlns:mc="http://schemas.openxmlformats.org/markup-compatibility/2006" xmlns:aink="http://schemas.microsoft.com/office/drawing/2016/ink" xmlns:am3d="http://schemas.microsoft.com/office/drawing/2017/model3d" xmlns:o="urn:schemas-microsoft-com:office:office" xmlns:oel="http://schemas.microsoft.com/office/2019/extlst" xmlns:r="http://schemas.openxmlformats.org/officeDocument/2006/relationships" xmlns:m="http://schemas.openxmlformats.org/officeDocument/2006/math" xmlns:v="urn:schemas-microsoft-com:vml" xmlns:wp14="http://schemas.microsoft.com/office/word/2010/wordprocessingDrawing" xmlns:wp="http://schemas.openxmlformats.org/drawingml/2006/wordprocessingDrawing" xmlns:w10="urn:schemas-microsoft-com:office:word" xmlns:w="http://schemas.openxmlformats.org/wordprocessingml/2006/main" xmlns:w14="http://schemas.microsoft.com/office/word/2010/wordml" xmlns:w15="http://schemas.microsoft.com/office/word/2012/wordml" xmlns:w16cex="http://schemas.microsoft.com/office/word/2018/wordml/cex" xmlns:w16cid="http://schemas.microsoft.com/office/word/2016/wordml/cid" xmlns:w16="http://schemas.microsoft.com/office/word/2018/wordml" xmlns:w16du="http://schemas.microsoft.com/office/word/2023/wordml/word16du" xmlns:w16sdtdh="http://schemas.microsoft.com/office/word/2020/wordml/sdtdatahash" xmlns:w16sdtfl="http://schemas.microsoft.com/office/word/2024/wordml/sdtformatlock" xmlns:w16se="http://schemas.microsoft.com/office/word/2015/wordml/symex" xmlns:wpg="http://schemas.microsoft.com/office/word/2010/wordprocessingGroup" xmlns:wpi="http://schemas.microsoft.com/office/word/2010/wordprocessingInk" xmlns:wne="http://schemas.microsoft.com/office/word/2006/wordml" xmlns:wps="http://schemas.microsoft.com/office/word/2010/wordprocessingShape" mc:Ignorable="w14 w15 w16se w16cid w16 w16cex w16sdtdh w16sdtfl w16du wp14">
   <w:abstractNum w:abstractNumId="0" w15:restartNumberingAfterBreak="0">
+    <w:nsid w:val="154A71E1"/>
+    <w:multiLevelType w:val="multilevel"/>
+    <w:tmpl w:val="361E81E6"/>
+    <w:lvl w:ilvl="0">
+      <w:start w:val="1"/>
+      <w:numFmt w:val="bullet"/>
+      <w:lvlText w:val=""/>
+      <w:lvlJc w:val="left"/>
+      <w:pPr>
+        <w:tabs>
+          <w:tab w:val="num" w:pos="720"/>
+        </w:tabs>
+        <w:ind w:left="720" w:hanging="360"/>
+      </w:pPr>
+      <w:rPr>
+        <w:rFonts w:ascii="Symbol" w:hAnsi="Symbol" w:hint="default"/>
+        <w:sz w:val="20"/>
+      </w:rPr>
+    </w:lvl>
+    <w:lvl w:ilvl="1" w:tentative="1">
+      <w:start w:val="1"/>
+      <w:numFmt w:val="bullet"/>
+      <w:lvlText w:val="o"/>
+      <w:lvlJc w:val="left"/>
+      <w:pPr>
+        <w:tabs>
+          <w:tab w:val="num" w:pos="1440"/>
+        </w:tabs>
+        <w:ind w:left="1440" w:hanging="360"/>
+      </w:pPr>
+      <w:rPr>
+        <w:rFonts w:ascii="Courier New" w:hAnsi="Courier New" w:hint="default"/>
+        <w:sz w:val="20"/>
+      </w:rPr>
+    </w:lvl>
+    <w:lvl w:ilvl="2" w:tentative="1">
+      <w:start w:val="1"/>
+      <w:numFmt w:val="bullet"/>
+      <w:lvlText w:val=""/>
+      <w:lvlJc w:val="left"/>
+      <w:pPr>
+        <w:tabs>
+          <w:tab w:val="num" w:pos="2160"/>
+        </w:tabs>
+        <w:ind w:left="2160" w:hanging="360"/>
+      </w:pPr>
+      <w:rPr>
+        <w:rFonts w:ascii="Wingdings" w:hAnsi="Wingdings" w:hint="default"/>
+        <w:sz w:val="20"/>
+      </w:rPr>
+    </w:lvl>
+    <w:lvl w:ilvl="3" w:tentative="1">
+      <w:start w:val="1"/>
+      <w:numFmt w:val="bullet"/>
+      <w:lvlText w:val=""/>
+      <w:lvlJc w:val="left"/>
+      <w:pPr>
+        <w:tabs>
+          <w:tab w:val="num" w:pos="2880"/>
+        </w:tabs>
+        <w:ind w:left="2880" w:hanging="360"/>
+      </w:pPr>
+      <w:rPr>
+        <w:rFonts w:ascii="Wingdings" w:hAnsi="Wingdings" w:hint="default"/>
+        <w:sz w:val="20"/>
+      </w:rPr>
+    </w:lvl>
+    <w:lvl w:ilvl="4" w:tentative="1">
+      <w:start w:val="1"/>
+      <w:numFmt w:val="bullet"/>
+      <w:lvlText w:val=""/>
+      <w:lvlJc w:val="left"/>
+      <w:pPr>
+        <w:tabs>
+          <w:tab w:val="num" w:pos="3600"/>
+        </w:tabs>
+        <w:ind w:left="3600" w:hanging="360"/>
+      </w:pPr>
+      <w:rPr>
+        <w:rFonts w:ascii="Wingdings" w:hAnsi="Wingdings" w:hint="default"/>
+        <w:sz w:val="20"/>
+      </w:rPr>
+    </w:lvl>
+    <w:lvl w:ilvl="5" w:tentative="1">
+      <w:start w:val="1"/>
+      <w:numFmt w:val="bullet"/>
+      <w:lvlText w:val=""/>
+      <w:lvlJc w:val="left"/>
+      <w:pPr>
+        <w:tabs>
+          <w:tab w:val="num" w:pos="4320"/>
+        </w:tabs>
+        <w:ind w:left="4320" w:hanging="360"/>
+      </w:pPr>
+      <w:rPr>
+        <w:rFonts w:ascii="Wingdings" w:hAnsi="Wingdings" w:hint="default"/>
+        <w:sz w:val="20"/>
+      </w:rPr>
+    </w:lvl>
+    <w:lvl w:ilvl="6" w:tentative="1">
+      <w:start w:val="1"/>
+      <w:numFmt w:val="bullet"/>
+      <w:lvlText w:val=""/>
+      <w:lvlJc w:val="left"/>
+      <w:pPr>
+        <w:tabs>
+          <w:tab w:val="num" w:pos="5040"/>
+        </w:tabs>
+        <w:ind w:left="5040" w:hanging="360"/>
+      </w:pPr>
+      <w:rPr>
+        <w:rFonts w:ascii="Wingdings" w:hAnsi="Wingdings" w:hint="default"/>
+        <w:sz w:val="20"/>
+      </w:rPr>
+    </w:lvl>
+    <w:lvl w:ilvl="7" w:tentative="1">
+      <w:start w:val="1"/>
+      <w:numFmt w:val="bullet"/>
+      <w:lvlText w:val=""/>
+      <w:lvlJc w:val="left"/>
+      <w:pPr>
+        <w:tabs>
+          <w:tab w:val="num" w:pos="5760"/>
+        </w:tabs>
+        <w:ind w:left="5760" w:hanging="360"/>
+      </w:pPr>
+      <w:rPr>
+        <w:rFonts w:ascii="Wingdings" w:hAnsi="Wingdings" w:hint="default"/>
+        <w:sz w:val="20"/>
+      </w:rPr>
+    </w:lvl>
+    <w:lvl w:ilvl="8" w:tentative="1">
+      <w:start w:val="1"/>
+      <w:numFmt w:val="bullet"/>
+      <w:lvlText w:val=""/>
+      <w:lvlJc w:val="left"/>
+      <w:pPr>
+        <w:tabs>
+          <w:tab w:val="num" w:pos="6480"/>
+        </w:tabs>
+        <w:ind w:left="6480" w:hanging="360"/>
+      </w:pPr>
+      <w:rPr>
+        <w:rFonts w:ascii="Wingdings" w:hAnsi="Wingdings" w:hint="default"/>
+        <w:sz w:val="20"/>
+      </w:rPr>
+    </w:lvl>
+  </w:abstractNum>
+  <w:abstractNum w:abstractNumId="1" w15:restartNumberingAfterBreak="0">
+    <w:nsid w:val="37A86F2C"/>
+    <w:multiLevelType w:val="multilevel"/>
+    <w:tmpl w:val="5ECE966C"/>
+    <w:lvl w:ilvl="0">
+      <w:start w:val="1"/>
+      <w:numFmt w:val="bullet"/>
+      <w:lvlText w:val=""/>
+      <w:lvlJc w:val="left"/>
+      <w:pPr>
+        <w:tabs>
+          <w:tab w:val="num" w:pos="720"/>
+        </w:tabs>
+        <w:ind w:left="720" w:hanging="360"/>
+      </w:pPr>
+      <w:rPr>
+        <w:rFonts w:ascii="Symbol" w:hAnsi="Symbol" w:hint="default"/>
+        <w:sz w:val="20"/>
+      </w:rPr>
+    </w:lvl>
+    <w:lvl w:ilvl="1" w:tentative="1">
+      <w:start w:val="1"/>
+      <w:numFmt w:val="bullet"/>
+      <w:lvlText w:val="o"/>
+      <w:lvlJc w:val="left"/>
+      <w:pPr>
+        <w:tabs>
+          <w:tab w:val="num" w:pos="1440"/>
+        </w:tabs>
+        <w:ind w:left="1440" w:hanging="360"/>
+      </w:pPr>
+      <w:rPr>
+        <w:rFonts w:ascii="Courier New" w:hAnsi="Courier New" w:hint="default"/>
+        <w:sz w:val="20"/>
+      </w:rPr>
+    </w:lvl>
+    <w:lvl w:ilvl="2" w:tentative="1">
+      <w:start w:val="1"/>
+      <w:numFmt w:val="bullet"/>
+      <w:lvlText w:val=""/>
+      <w:lvlJc w:val="left"/>
+      <w:pPr>
+        <w:tabs>
+          <w:tab w:val="num" w:pos="2160"/>
+        </w:tabs>
+        <w:ind w:left="2160" w:hanging="360"/>
+      </w:pPr>
+      <w:rPr>
+        <w:rFonts w:ascii="Wingdings" w:hAnsi="Wingdings" w:hint="default"/>
+        <w:sz w:val="20"/>
+      </w:rPr>
+    </w:lvl>
+    <w:lvl w:ilvl="3" w:tentative="1">
+      <w:start w:val="1"/>
+      <w:numFmt w:val="bullet"/>
+      <w:lvlText w:val=""/>
+      <w:lvlJc w:val="left"/>
+      <w:pPr>
+        <w:tabs>
+          <w:tab w:val="num" w:pos="2880"/>
+        </w:tabs>
+        <w:ind w:left="2880" w:hanging="360"/>
+      </w:pPr>
+      <w:rPr>
+        <w:rFonts w:ascii="Wingdings" w:hAnsi="Wingdings" w:hint="default"/>
+        <w:sz w:val="20"/>
+      </w:rPr>
+    </w:lvl>
+    <w:lvl w:ilvl="4" w:tentative="1">
+      <w:start w:val="1"/>
+      <w:numFmt w:val="bullet"/>
+      <w:lvlText w:val=""/>
+      <w:lvlJc w:val="left"/>
+      <w:pPr>
+        <w:tabs>
+          <w:tab w:val="num" w:pos="3600"/>
+        </w:tabs>
+        <w:ind w:left="3600" w:hanging="360"/>
+      </w:pPr>
+      <w:rPr>
+        <w:rFonts w:ascii="Wingdings" w:hAnsi="Wingdings" w:hint="default"/>
+        <w:sz w:val="20"/>
+      </w:rPr>
+    </w:lvl>
+    <w:lvl w:ilvl="5" w:tentative="1">
+      <w:start w:val="1"/>
+      <w:numFmt w:val="bullet"/>
+      <w:lvlText w:val=""/>
+      <w:lvlJc w:val="left"/>
+      <w:pPr>
+        <w:tabs>
+          <w:tab w:val="num" w:pos="4320"/>
+        </w:tabs>
+        <w:ind w:left="4320" w:hanging="360"/>
+      </w:pPr>
+      <w:rPr>
+        <w:rFonts w:ascii="Wingdings" w:hAnsi="Wingdings" w:hint="default"/>
+        <w:sz w:val="20"/>
+      </w:rPr>
+    </w:lvl>
+    <w:lvl w:ilvl="6" w:tentative="1">
+      <w:start w:val="1"/>
+      <w:numFmt w:val="bullet"/>
+      <w:lvlText w:val=""/>
+      <w:lvlJc w:val="left"/>
+      <w:pPr>
+        <w:tabs>
+          <w:tab w:val="num" w:pos="5040"/>
+        </w:tabs>
+        <w:ind w:left="5040" w:hanging="360"/>
+      </w:pPr>
+      <w:rPr>
+        <w:rFonts w:ascii="Wingdings" w:hAnsi="Wingdings" w:hint="default"/>
+        <w:sz w:val="20"/>
+      </w:rPr>
+    </w:lvl>
+    <w:lvl w:ilvl="7" w:tentative="1">
+      <w:start w:val="1"/>
+      <w:numFmt w:val="bullet"/>
+      <w:lvlText w:val=""/>
+      <w:lvlJc w:val="left"/>
+      <w:pPr>
+        <w:tabs>
+          <w:tab w:val="num" w:pos="5760"/>
+        </w:tabs>
+        <w:ind w:left="5760" w:hanging="360"/>
+      </w:pPr>
+      <w:rPr>
+        <w:rFonts w:ascii="Wingdings" w:hAnsi="Wingdings" w:hint="default"/>
+        <w:sz w:val="20"/>
+      </w:rPr>
+    </w:lvl>
+    <w:lvl w:ilvl="8" w:tentative="1">
+      <w:start w:val="1"/>
+      <w:numFmt w:val="bullet"/>
+      <w:lvlText w:val=""/>
+      <w:lvlJc w:val="left"/>
+      <w:pPr>
+        <w:tabs>
+          <w:tab w:val="num" w:pos="6480"/>
+        </w:tabs>
+        <w:ind w:left="6480" w:hanging="360"/>
+      </w:pPr>
+      <w:rPr>
+        <w:rFonts w:ascii="Wingdings" w:hAnsi="Wingdings" w:hint="default"/>
+        <w:sz w:val="20"/>
+      </w:rPr>
+    </w:lvl>
+  </w:abstractNum>
+  <w:abstractNum w:abstractNumId="2" w15:restartNumberingAfterBreak="0">
     <w:nsid w:val="3C2F8207"/>
     <w:multiLevelType w:val="hybridMultilevel"/>
     <w:tmpl w:val="1E8C28C2"/>
@@ -908,7 +2365,7 @@
       </w:pPr>
     </w:lvl>
   </w:abstractNum>
-  <w:abstractNum w:abstractNumId="1" w15:restartNumberingAfterBreak="0">
+  <w:abstractNum w:abstractNumId="3" w15:restartNumberingAfterBreak="0">
     <w:nsid w:val="44900513"/>
     <w:multiLevelType w:val="hybridMultilevel"/>
     <w:tmpl w:val="53F08F42"/>
@@ -1020,7 +2477,96 @@
       </w:rPr>
     </w:lvl>
   </w:abstractNum>
-  <w:abstractNum w:abstractNumId="2" w15:restartNumberingAfterBreak="0">
+  <w:abstractNum w:abstractNumId="4" w15:restartNumberingAfterBreak="0">
+    <w:nsid w:val="44DB485B"/>
+    <w:multiLevelType w:val="hybridMultilevel"/>
+    <w:tmpl w:val="47E46DB0"/>
+    <w:lvl w:ilvl="0" w:tplc="0C09000F">
+      <w:start w:val="1"/>
+      <w:numFmt w:val="decimal"/>
+      <w:lvlText w:val="%1."/>
+      <w:lvlJc w:val="left"/>
+      <w:pPr>
+        <w:ind w:left="720" w:hanging="360"/>
+      </w:pPr>
+      <w:rPr>
+        <w:rFonts w:hint="default"/>
+      </w:rPr>
+    </w:lvl>
+    <w:lvl w:ilvl="1" w:tplc="0C090019" w:tentative="1">
+      <w:start w:val="1"/>
+      <w:numFmt w:val="lowerLetter"/>
+      <w:lvlText w:val="%2."/>
+      <w:lvlJc w:val="left"/>
+      <w:pPr>
+        <w:ind w:left="1440" w:hanging="360"/>
+      </w:pPr>
+    </w:lvl>
+    <w:lvl w:ilvl="2" w:tplc="0C09001B" w:tentative="1">
+      <w:start w:val="1"/>
+      <w:numFmt w:val="lowerRoman"/>
+      <w:lvlText w:val="%3."/>
+      <w:lvlJc w:val="right"/>
+      <w:pPr>
+        <w:ind w:left="2160" w:hanging="180"/>
+      </w:pPr>
+    </w:lvl>
+    <w:lvl w:ilvl="3" w:tplc="0C09000F" w:tentative="1">
+      <w:start w:val="1"/>
+      <w:numFmt w:val="decimal"/>
+      <w:lvlText w:val="%4."/>
+      <w:lvlJc w:val="left"/>
+      <w:pPr>
+        <w:ind w:left="2880" w:hanging="360"/>
+      </w:pPr>
+    </w:lvl>
+    <w:lvl w:ilvl="4" w:tplc="0C090019" w:tentative="1">
+      <w:start w:val="1"/>
+      <w:numFmt w:val="lowerLetter"/>
+      <w:lvlText w:val="%5."/>
+      <w:lvlJc w:val="left"/>
+      <w:pPr>
+        <w:ind w:left="3600" w:hanging="360"/>
+      </w:pPr>
+    </w:lvl>
+    <w:lvl w:ilvl="5" w:tplc="0C09001B" w:tentative="1">
+      <w:start w:val="1"/>
+      <w:numFmt w:val="lowerRoman"/>
+      <w:lvlText w:val="%6."/>
+      <w:lvlJc w:val="right"/>
+      <w:pPr>
+        <w:ind w:left="4320" w:hanging="180"/>
+      </w:pPr>
+    </w:lvl>
+    <w:lvl w:ilvl="6" w:tplc="0C09000F" w:tentative="1">
+      <w:start w:val="1"/>
+      <w:numFmt w:val="decimal"/>
+      <w:lvlText w:val="%7."/>
+      <w:lvlJc w:val="left"/>
+      <w:pPr>
+        <w:ind w:left="5040" w:hanging="360"/>
+      </w:pPr>
+    </w:lvl>
+    <w:lvl w:ilvl="7" w:tplc="0C090019" w:tentative="1">
+      <w:start w:val="1"/>
+      <w:numFmt w:val="lowerLetter"/>
+      <w:lvlText w:val="%8."/>
+      <w:lvlJc w:val="left"/>
+      <w:pPr>
+        <w:ind w:left="5760" w:hanging="360"/>
+      </w:pPr>
+    </w:lvl>
+    <w:lvl w:ilvl="8" w:tplc="0C09001B" w:tentative="1">
+      <w:start w:val="1"/>
+      <w:numFmt w:val="lowerRoman"/>
+      <w:lvlText w:val="%9."/>
+      <w:lvlJc w:val="right"/>
+      <w:pPr>
+        <w:ind w:left="6480" w:hanging="180"/>
+      </w:pPr>
+    </w:lvl>
+  </w:abstractNum>
+  <w:abstractNum w:abstractNumId="5" w15:restartNumberingAfterBreak="0">
     <w:nsid w:val="4923DB14"/>
     <w:multiLevelType w:val="hybridMultilevel"/>
     <w:tmpl w:val="8416CB06"/>
@@ -1106,7 +2652,7 @@
       </w:pPr>
     </w:lvl>
   </w:abstractNum>
-  <w:abstractNum w:abstractNumId="3" w15:restartNumberingAfterBreak="0">
+  <w:abstractNum w:abstractNumId="6" w15:restartNumberingAfterBreak="0">
     <w:nsid w:val="49EE04D4"/>
     <w:multiLevelType w:val="hybridMultilevel"/>
     <w:tmpl w:val="3814AC62"/>
@@ -1218,7 +2764,7 @@
       </w:rPr>
     </w:lvl>
   </w:abstractNum>
-  <w:abstractNum w:abstractNumId="4" w15:restartNumberingAfterBreak="0">
+  <w:abstractNum w:abstractNumId="7" w15:restartNumberingAfterBreak="0">
     <w:nsid w:val="4F2C1698"/>
     <w:multiLevelType w:val="multilevel"/>
     <w:tmpl w:val="D3AE4D18"/>
@@ -1367,20 +2913,789 @@
       </w:rPr>
     </w:lvl>
   </w:abstractNum>
+  <w:abstractNum w:abstractNumId="8" w15:restartNumberingAfterBreak="0">
+    <w:nsid w:val="77264255"/>
+    <w:multiLevelType w:val="multilevel"/>
+    <w:tmpl w:val="FEB88570"/>
+    <w:lvl w:ilvl="0">
+      <w:start w:val="1"/>
+      <w:numFmt w:val="bullet"/>
+      <w:lvlText w:val=""/>
+      <w:lvlJc w:val="left"/>
+      <w:pPr>
+        <w:tabs>
+          <w:tab w:val="num" w:pos="720"/>
+        </w:tabs>
+        <w:ind w:left="720" w:hanging="360"/>
+      </w:pPr>
+      <w:rPr>
+        <w:rFonts w:ascii="Symbol" w:hAnsi="Symbol" w:hint="default"/>
+        <w:sz w:val="20"/>
+      </w:rPr>
+    </w:lvl>
+    <w:lvl w:ilvl="1" w:tentative="1">
+      <w:start w:val="1"/>
+      <w:numFmt w:val="bullet"/>
+      <w:lvlText w:val="o"/>
+      <w:lvlJc w:val="left"/>
+      <w:pPr>
+        <w:tabs>
+          <w:tab w:val="num" w:pos="1440"/>
+        </w:tabs>
+        <w:ind w:left="1440" w:hanging="360"/>
+      </w:pPr>
+      <w:rPr>
+        <w:rFonts w:ascii="Courier New" w:hAnsi="Courier New" w:hint="default"/>
+        <w:sz w:val="20"/>
+      </w:rPr>
+    </w:lvl>
+    <w:lvl w:ilvl="2" w:tentative="1">
+      <w:start w:val="1"/>
+      <w:numFmt w:val="bullet"/>
+      <w:lvlText w:val=""/>
+      <w:lvlJc w:val="left"/>
+      <w:pPr>
+        <w:tabs>
+          <w:tab w:val="num" w:pos="2160"/>
+        </w:tabs>
+        <w:ind w:left="2160" w:hanging="360"/>
+      </w:pPr>
+      <w:rPr>
+        <w:rFonts w:ascii="Wingdings" w:hAnsi="Wingdings" w:hint="default"/>
+        <w:sz w:val="20"/>
+      </w:rPr>
+    </w:lvl>
+    <w:lvl w:ilvl="3" w:tentative="1">
+      <w:start w:val="1"/>
+      <w:numFmt w:val="bullet"/>
+      <w:lvlText w:val=""/>
+      <w:lvlJc w:val="left"/>
+      <w:pPr>
+        <w:tabs>
+          <w:tab w:val="num" w:pos="2880"/>
+        </w:tabs>
+        <w:ind w:left="2880" w:hanging="360"/>
+      </w:pPr>
+      <w:rPr>
+        <w:rFonts w:ascii="Wingdings" w:hAnsi="Wingdings" w:hint="default"/>
+        <w:sz w:val="20"/>
+      </w:rPr>
+    </w:lvl>
+    <w:lvl w:ilvl="4" w:tentative="1">
+      <w:start w:val="1"/>
+      <w:numFmt w:val="bullet"/>
+      <w:lvlText w:val=""/>
+      <w:lvlJc w:val="left"/>
+      <w:pPr>
+        <w:tabs>
+          <w:tab w:val="num" w:pos="3600"/>
+        </w:tabs>
+        <w:ind w:left="3600" w:hanging="360"/>
+      </w:pPr>
+      <w:rPr>
+        <w:rFonts w:ascii="Wingdings" w:hAnsi="Wingdings" w:hint="default"/>
+        <w:sz w:val="20"/>
+      </w:rPr>
+    </w:lvl>
+    <w:lvl w:ilvl="5" w:tentative="1">
+      <w:start w:val="1"/>
+      <w:numFmt w:val="bullet"/>
+      <w:lvlText w:val=""/>
+      <w:lvlJc w:val="left"/>
+      <w:pPr>
+        <w:tabs>
+          <w:tab w:val="num" w:pos="4320"/>
+        </w:tabs>
+        <w:ind w:left="4320" w:hanging="360"/>
+      </w:pPr>
+      <w:rPr>
+        <w:rFonts w:ascii="Wingdings" w:hAnsi="Wingdings" w:hint="default"/>
+        <w:sz w:val="20"/>
+      </w:rPr>
+    </w:lvl>
+    <w:lvl w:ilvl="6" w:tentative="1">
+      <w:start w:val="1"/>
+      <w:numFmt w:val="bullet"/>
+      <w:lvlText w:val=""/>
+      <w:lvlJc w:val="left"/>
+      <w:pPr>
+        <w:tabs>
+          <w:tab w:val="num" w:pos="5040"/>
+        </w:tabs>
+        <w:ind w:left="5040" w:hanging="360"/>
+      </w:pPr>
+      <w:rPr>
+        <w:rFonts w:ascii="Wingdings" w:hAnsi="Wingdings" w:hint="default"/>
+        <w:sz w:val="20"/>
+      </w:rPr>
+    </w:lvl>
+    <w:lvl w:ilvl="7" w:tentative="1">
+      <w:start w:val="1"/>
+      <w:numFmt w:val="bullet"/>
+      <w:lvlText w:val=""/>
+      <w:lvlJc w:val="left"/>
+      <w:pPr>
+        <w:tabs>
+          <w:tab w:val="num" w:pos="5760"/>
+        </w:tabs>
+        <w:ind w:left="5760" w:hanging="360"/>
+      </w:pPr>
+      <w:rPr>
+        <w:rFonts w:ascii="Wingdings" w:hAnsi="Wingdings" w:hint="default"/>
+        <w:sz w:val="20"/>
+      </w:rPr>
+    </w:lvl>
+    <w:lvl w:ilvl="8" w:tentative="1">
+      <w:start w:val="1"/>
+      <w:numFmt w:val="bullet"/>
+      <w:lvlText w:val=""/>
+      <w:lvlJc w:val="left"/>
+      <w:pPr>
+        <w:tabs>
+          <w:tab w:val="num" w:pos="6480"/>
+        </w:tabs>
+        <w:ind w:left="6480" w:hanging="360"/>
+      </w:pPr>
+      <w:rPr>
+        <w:rFonts w:ascii="Wingdings" w:hAnsi="Wingdings" w:hint="default"/>
+        <w:sz w:val="20"/>
+      </w:rPr>
+    </w:lvl>
+  </w:abstractNum>
+  <w:abstractNum w:abstractNumId="9" w15:restartNumberingAfterBreak="0">
+    <w:nsid w:val="7CFF0DAE"/>
+    <w:multiLevelType w:val="multilevel"/>
+    <w:tmpl w:val="E9865D46"/>
+    <w:lvl w:ilvl="0">
+      <w:start w:val="1"/>
+      <w:numFmt w:val="bullet"/>
+      <w:lvlText w:val=""/>
+      <w:lvlJc w:val="left"/>
+      <w:pPr>
+        <w:tabs>
+          <w:tab w:val="num" w:pos="720"/>
+        </w:tabs>
+        <w:ind w:left="720" w:hanging="360"/>
+      </w:pPr>
+      <w:rPr>
+        <w:rFonts w:ascii="Symbol" w:hAnsi="Symbol" w:hint="default"/>
+        <w:sz w:val="20"/>
+      </w:rPr>
+    </w:lvl>
+    <w:lvl w:ilvl="1" w:tentative="1">
+      <w:start w:val="1"/>
+      <w:numFmt w:val="bullet"/>
+      <w:lvlText w:val="o"/>
+      <w:lvlJc w:val="left"/>
+      <w:pPr>
+        <w:tabs>
+          <w:tab w:val="num" w:pos="1440"/>
+        </w:tabs>
+        <w:ind w:left="1440" w:hanging="360"/>
+      </w:pPr>
+      <w:rPr>
+        <w:rFonts w:ascii="Courier New" w:hAnsi="Courier New" w:hint="default"/>
+        <w:sz w:val="20"/>
+      </w:rPr>
+    </w:lvl>
+    <w:lvl w:ilvl="2" w:tentative="1">
+      <w:start w:val="1"/>
+      <w:numFmt w:val="bullet"/>
+      <w:lvlText w:val=""/>
+      <w:lvlJc w:val="left"/>
+      <w:pPr>
+        <w:tabs>
+          <w:tab w:val="num" w:pos="2160"/>
+        </w:tabs>
+        <w:ind w:left="2160" w:hanging="360"/>
+      </w:pPr>
+      <w:rPr>
+        <w:rFonts w:ascii="Wingdings" w:hAnsi="Wingdings" w:hint="default"/>
+        <w:sz w:val="20"/>
+      </w:rPr>
+    </w:lvl>
+    <w:lvl w:ilvl="3" w:tentative="1">
+      <w:start w:val="1"/>
+      <w:numFmt w:val="bullet"/>
+      <w:lvlText w:val=""/>
+      <w:lvlJc w:val="left"/>
+      <w:pPr>
+        <w:tabs>
+          <w:tab w:val="num" w:pos="2880"/>
+        </w:tabs>
+        <w:ind w:left="2880" w:hanging="360"/>
+      </w:pPr>
+      <w:rPr>
+        <w:rFonts w:ascii="Wingdings" w:hAnsi="Wingdings" w:hint="default"/>
+        <w:sz w:val="20"/>
+      </w:rPr>
+    </w:lvl>
+    <w:lvl w:ilvl="4" w:tentative="1">
+      <w:start w:val="1"/>
+      <w:numFmt w:val="bullet"/>
+      <w:lvlText w:val=""/>
+      <w:lvlJc w:val="left"/>
+      <w:pPr>
+        <w:tabs>
+          <w:tab w:val="num" w:pos="3600"/>
+        </w:tabs>
+        <w:ind w:left="3600" w:hanging="360"/>
+      </w:pPr>
+      <w:rPr>
+        <w:rFonts w:ascii="Wingdings" w:hAnsi="Wingdings" w:hint="default"/>
+        <w:sz w:val="20"/>
+      </w:rPr>
+    </w:lvl>
+    <w:lvl w:ilvl="5" w:tentative="1">
+      <w:start w:val="1"/>
+      <w:numFmt w:val="bullet"/>
+      <w:lvlText w:val=""/>
+      <w:lvlJc w:val="left"/>
+      <w:pPr>
+        <w:tabs>
+          <w:tab w:val="num" w:pos="4320"/>
+        </w:tabs>
+        <w:ind w:left="4320" w:hanging="360"/>
+      </w:pPr>
+      <w:rPr>
+        <w:rFonts w:ascii="Wingdings" w:hAnsi="Wingdings" w:hint="default"/>
+        <w:sz w:val="20"/>
+      </w:rPr>
+    </w:lvl>
+    <w:lvl w:ilvl="6" w:tentative="1">
+      <w:start w:val="1"/>
+      <w:numFmt w:val="bullet"/>
+      <w:lvlText w:val=""/>
+      <w:lvlJc w:val="left"/>
+      <w:pPr>
+        <w:tabs>
+          <w:tab w:val="num" w:pos="5040"/>
+        </w:tabs>
+        <w:ind w:left="5040" w:hanging="360"/>
+      </w:pPr>
+      <w:rPr>
+        <w:rFonts w:ascii="Wingdings" w:hAnsi="Wingdings" w:hint="default"/>
+        <w:sz w:val="20"/>
+      </w:rPr>
+    </w:lvl>
+    <w:lvl w:ilvl="7" w:tentative="1">
+      <w:start w:val="1"/>
+      <w:numFmt w:val="bullet"/>
+      <w:lvlText w:val=""/>
+      <w:lvlJc w:val="left"/>
+      <w:pPr>
+        <w:tabs>
+          <w:tab w:val="num" w:pos="5760"/>
+        </w:tabs>
+        <w:ind w:left="5760" w:hanging="360"/>
+      </w:pPr>
+      <w:rPr>
+        <w:rFonts w:ascii="Wingdings" w:hAnsi="Wingdings" w:hint="default"/>
+        <w:sz w:val="20"/>
+      </w:rPr>
+    </w:lvl>
+    <w:lvl w:ilvl="8" w:tentative="1">
+      <w:start w:val="1"/>
+      <w:numFmt w:val="bullet"/>
+      <w:lvlText w:val=""/>
+      <w:lvlJc w:val="left"/>
+      <w:pPr>
+        <w:tabs>
+          <w:tab w:val="num" w:pos="6480"/>
+        </w:tabs>
+        <w:ind w:left="6480" w:hanging="360"/>
+      </w:pPr>
+      <w:rPr>
+        <w:rFonts w:ascii="Wingdings" w:hAnsi="Wingdings" w:hint="default"/>
+        <w:sz w:val="20"/>
+      </w:rPr>
+    </w:lvl>
+  </w:abstractNum>
+  <w:abstractNum w:abstractNumId="10" w15:restartNumberingAfterBreak="0">
+    <w:nsid w:val="7D630458"/>
+    <w:multiLevelType w:val="multilevel"/>
+    <w:tmpl w:val="CAA84226"/>
+    <w:lvl w:ilvl="0">
+      <w:start w:val="1"/>
+      <w:numFmt w:val="bullet"/>
+      <w:lvlText w:val=""/>
+      <w:lvlJc w:val="left"/>
+      <w:pPr>
+        <w:tabs>
+          <w:tab w:val="num" w:pos="720"/>
+        </w:tabs>
+        <w:ind w:left="720" w:hanging="360"/>
+      </w:pPr>
+      <w:rPr>
+        <w:rFonts w:ascii="Symbol" w:hAnsi="Symbol" w:hint="default"/>
+        <w:sz w:val="20"/>
+      </w:rPr>
+    </w:lvl>
+    <w:lvl w:ilvl="1" w:tentative="1">
+      <w:start w:val="1"/>
+      <w:numFmt w:val="bullet"/>
+      <w:lvlText w:val="o"/>
+      <w:lvlJc w:val="left"/>
+      <w:pPr>
+        <w:tabs>
+          <w:tab w:val="num" w:pos="1440"/>
+        </w:tabs>
+        <w:ind w:left="1440" w:hanging="360"/>
+      </w:pPr>
+      <w:rPr>
+        <w:rFonts w:ascii="Courier New" w:hAnsi="Courier New" w:hint="default"/>
+        <w:sz w:val="20"/>
+      </w:rPr>
+    </w:lvl>
+    <w:lvl w:ilvl="2" w:tentative="1">
+      <w:start w:val="1"/>
+      <w:numFmt w:val="bullet"/>
+      <w:lvlText w:val=""/>
+      <w:lvlJc w:val="left"/>
+      <w:pPr>
+        <w:tabs>
+          <w:tab w:val="num" w:pos="2160"/>
+        </w:tabs>
+        <w:ind w:left="2160" w:hanging="360"/>
+      </w:pPr>
+      <w:rPr>
+        <w:rFonts w:ascii="Wingdings" w:hAnsi="Wingdings" w:hint="default"/>
+        <w:sz w:val="20"/>
+      </w:rPr>
+    </w:lvl>
+    <w:lvl w:ilvl="3" w:tentative="1">
+      <w:start w:val="1"/>
+      <w:numFmt w:val="bullet"/>
+      <w:lvlText w:val=""/>
+      <w:lvlJc w:val="left"/>
+      <w:pPr>
+        <w:tabs>
+          <w:tab w:val="num" w:pos="2880"/>
+        </w:tabs>
+        <w:ind w:left="2880" w:hanging="360"/>
+      </w:pPr>
+      <w:rPr>
+        <w:rFonts w:ascii="Wingdings" w:hAnsi="Wingdings" w:hint="default"/>
+        <w:sz w:val="20"/>
+      </w:rPr>
+    </w:lvl>
+    <w:lvl w:ilvl="4" w:tentative="1">
+      <w:start w:val="1"/>
+      <w:numFmt w:val="bullet"/>
+      <w:lvlText w:val=""/>
+      <w:lvlJc w:val="left"/>
+      <w:pPr>
+        <w:tabs>
+          <w:tab w:val="num" w:pos="3600"/>
+        </w:tabs>
+        <w:ind w:left="3600" w:hanging="360"/>
+      </w:pPr>
+      <w:rPr>
+        <w:rFonts w:ascii="Wingdings" w:hAnsi="Wingdings" w:hint="default"/>
+        <w:sz w:val="20"/>
+      </w:rPr>
+    </w:lvl>
+    <w:lvl w:ilvl="5" w:tentative="1">
+      <w:start w:val="1"/>
+      <w:numFmt w:val="bullet"/>
+      <w:lvlText w:val=""/>
+      <w:lvlJc w:val="left"/>
+      <w:pPr>
+        <w:tabs>
+          <w:tab w:val="num" w:pos="4320"/>
+        </w:tabs>
+        <w:ind w:left="4320" w:hanging="360"/>
+      </w:pPr>
+      <w:rPr>
+        <w:rFonts w:ascii="Wingdings" w:hAnsi="Wingdings" w:hint="default"/>
+        <w:sz w:val="20"/>
+      </w:rPr>
+    </w:lvl>
+    <w:lvl w:ilvl="6" w:tentative="1">
+      <w:start w:val="1"/>
+      <w:numFmt w:val="bullet"/>
+      <w:lvlText w:val=""/>
+      <w:lvlJc w:val="left"/>
+      <w:pPr>
+        <w:tabs>
+          <w:tab w:val="num" w:pos="5040"/>
+        </w:tabs>
+        <w:ind w:left="5040" w:hanging="360"/>
+      </w:pPr>
+      <w:rPr>
+        <w:rFonts w:ascii="Wingdings" w:hAnsi="Wingdings" w:hint="default"/>
+        <w:sz w:val="20"/>
+      </w:rPr>
+    </w:lvl>
+    <w:lvl w:ilvl="7" w:tentative="1">
+      <w:start w:val="1"/>
+      <w:numFmt w:val="bullet"/>
+      <w:lvlText w:val=""/>
+      <w:lvlJc w:val="left"/>
+      <w:pPr>
+        <w:tabs>
+          <w:tab w:val="num" w:pos="5760"/>
+        </w:tabs>
+        <w:ind w:left="5760" w:hanging="360"/>
+      </w:pPr>
+      <w:rPr>
+        <w:rFonts w:ascii="Wingdings" w:hAnsi="Wingdings" w:hint="default"/>
+        <w:sz w:val="20"/>
+      </w:rPr>
+    </w:lvl>
+    <w:lvl w:ilvl="8" w:tentative="1">
+      <w:start w:val="1"/>
+      <w:numFmt w:val="bullet"/>
+      <w:lvlText w:val=""/>
+      <w:lvlJc w:val="left"/>
+      <w:pPr>
+        <w:tabs>
+          <w:tab w:val="num" w:pos="6480"/>
+        </w:tabs>
+        <w:ind w:left="6480" w:hanging="360"/>
+      </w:pPr>
+      <w:rPr>
+        <w:rFonts w:ascii="Wingdings" w:hAnsi="Wingdings" w:hint="default"/>
+        <w:sz w:val="20"/>
+      </w:rPr>
+    </w:lvl>
+  </w:abstractNum>
+  <w:abstractNum w:abstractNumId="11" w15:restartNumberingAfterBreak="0">
+    <w:nsid w:val="7F1B09CF"/>
+    <w:multiLevelType w:val="multilevel"/>
+    <w:tmpl w:val="EE503BE8"/>
+    <w:lvl w:ilvl="0">
+      <w:start w:val="1"/>
+      <w:numFmt w:val="bullet"/>
+      <w:lvlText w:val=""/>
+      <w:lvlJc w:val="left"/>
+      <w:pPr>
+        <w:tabs>
+          <w:tab w:val="num" w:pos="720"/>
+        </w:tabs>
+        <w:ind w:left="720" w:hanging="360"/>
+      </w:pPr>
+      <w:rPr>
+        <w:rFonts w:ascii="Symbol" w:hAnsi="Symbol" w:hint="default"/>
+        <w:sz w:val="20"/>
+      </w:rPr>
+    </w:lvl>
+    <w:lvl w:ilvl="1" w:tentative="1">
+      <w:start w:val="1"/>
+      <w:numFmt w:val="bullet"/>
+      <w:lvlText w:val="o"/>
+      <w:lvlJc w:val="left"/>
+      <w:pPr>
+        <w:tabs>
+          <w:tab w:val="num" w:pos="1440"/>
+        </w:tabs>
+        <w:ind w:left="1440" w:hanging="360"/>
+      </w:pPr>
+      <w:rPr>
+        <w:rFonts w:ascii="Courier New" w:hAnsi="Courier New" w:hint="default"/>
+        <w:sz w:val="20"/>
+      </w:rPr>
+    </w:lvl>
+    <w:lvl w:ilvl="2" w:tentative="1">
+      <w:start w:val="1"/>
+      <w:numFmt w:val="bullet"/>
+      <w:lvlText w:val=""/>
+      <w:lvlJc w:val="left"/>
+      <w:pPr>
+        <w:tabs>
+          <w:tab w:val="num" w:pos="2160"/>
+        </w:tabs>
+        <w:ind w:left="2160" w:hanging="360"/>
+      </w:pPr>
+      <w:rPr>
+        <w:rFonts w:ascii="Wingdings" w:hAnsi="Wingdings" w:hint="default"/>
+        <w:sz w:val="20"/>
+      </w:rPr>
+    </w:lvl>
+    <w:lvl w:ilvl="3" w:tentative="1">
+      <w:start w:val="1"/>
+      <w:numFmt w:val="bullet"/>
+      <w:lvlText w:val=""/>
+      <w:lvlJc w:val="left"/>
+      <w:pPr>
+        <w:tabs>
+          <w:tab w:val="num" w:pos="2880"/>
+        </w:tabs>
+        <w:ind w:left="2880" w:hanging="360"/>
+      </w:pPr>
+      <w:rPr>
+        <w:rFonts w:ascii="Wingdings" w:hAnsi="Wingdings" w:hint="default"/>
+        <w:sz w:val="20"/>
+      </w:rPr>
+    </w:lvl>
+    <w:lvl w:ilvl="4" w:tentative="1">
+      <w:start w:val="1"/>
+      <w:numFmt w:val="bullet"/>
+      <w:lvlText w:val=""/>
+      <w:lvlJc w:val="left"/>
+      <w:pPr>
+        <w:tabs>
+          <w:tab w:val="num" w:pos="3600"/>
+        </w:tabs>
+        <w:ind w:left="3600" w:hanging="360"/>
+      </w:pPr>
+      <w:rPr>
+        <w:rFonts w:ascii="Wingdings" w:hAnsi="Wingdings" w:hint="default"/>
+        <w:sz w:val="20"/>
+      </w:rPr>
+    </w:lvl>
+    <w:lvl w:ilvl="5" w:tentative="1">
+      <w:start w:val="1"/>
+      <w:numFmt w:val="bullet"/>
+      <w:lvlText w:val=""/>
+      <w:lvlJc w:val="left"/>
+      <w:pPr>
+        <w:tabs>
+          <w:tab w:val="num" w:pos="4320"/>
+        </w:tabs>
+        <w:ind w:left="4320" w:hanging="360"/>
+      </w:pPr>
+      <w:rPr>
+        <w:rFonts w:ascii="Wingdings" w:hAnsi="Wingdings" w:hint="default"/>
+        <w:sz w:val="20"/>
+      </w:rPr>
+    </w:lvl>
+    <w:lvl w:ilvl="6" w:tentative="1">
+      <w:start w:val="1"/>
+      <w:numFmt w:val="bullet"/>
+      <w:lvlText w:val=""/>
+      <w:lvlJc w:val="left"/>
+      <w:pPr>
+        <w:tabs>
+          <w:tab w:val="num" w:pos="5040"/>
+        </w:tabs>
+        <w:ind w:left="5040" w:hanging="360"/>
+      </w:pPr>
+      <w:rPr>
+        <w:rFonts w:ascii="Wingdings" w:hAnsi="Wingdings" w:hint="default"/>
+        <w:sz w:val="20"/>
+      </w:rPr>
+    </w:lvl>
+    <w:lvl w:ilvl="7" w:tentative="1">
+      <w:start w:val="1"/>
+      <w:numFmt w:val="bullet"/>
+      <w:lvlText w:val=""/>
+      <w:lvlJc w:val="left"/>
+      <w:pPr>
+        <w:tabs>
+          <w:tab w:val="num" w:pos="5760"/>
+        </w:tabs>
+        <w:ind w:left="5760" w:hanging="360"/>
+      </w:pPr>
+      <w:rPr>
+        <w:rFonts w:ascii="Wingdings" w:hAnsi="Wingdings" w:hint="default"/>
+        <w:sz w:val="20"/>
+      </w:rPr>
+    </w:lvl>
+    <w:lvl w:ilvl="8" w:tentative="1">
+      <w:start w:val="1"/>
+      <w:numFmt w:val="bullet"/>
+      <w:lvlText w:val=""/>
+      <w:lvlJc w:val="left"/>
+      <w:pPr>
+        <w:tabs>
+          <w:tab w:val="num" w:pos="6480"/>
+        </w:tabs>
+        <w:ind w:left="6480" w:hanging="360"/>
+      </w:pPr>
+      <w:rPr>
+        <w:rFonts w:ascii="Wingdings" w:hAnsi="Wingdings" w:hint="default"/>
+        <w:sz w:val="20"/>
+      </w:rPr>
+    </w:lvl>
+  </w:abstractNum>
+  <w:abstractNum w:abstractNumId="12" w15:restartNumberingAfterBreak="0">
+    <w:nsid w:val="7FDF740B"/>
+    <w:multiLevelType w:val="multilevel"/>
+    <w:tmpl w:val="1C040834"/>
+    <w:lvl w:ilvl="0">
+      <w:start w:val="1"/>
+      <w:numFmt w:val="bullet"/>
+      <w:lvlText w:val=""/>
+      <w:lvlJc w:val="left"/>
+      <w:pPr>
+        <w:tabs>
+          <w:tab w:val="num" w:pos="720"/>
+        </w:tabs>
+        <w:ind w:left="720" w:hanging="360"/>
+      </w:pPr>
+      <w:rPr>
+        <w:rFonts w:ascii="Symbol" w:hAnsi="Symbol" w:hint="default"/>
+        <w:sz w:val="20"/>
+      </w:rPr>
+    </w:lvl>
+    <w:lvl w:ilvl="1" w:tentative="1">
+      <w:start w:val="1"/>
+      <w:numFmt w:val="bullet"/>
+      <w:lvlText w:val="o"/>
+      <w:lvlJc w:val="left"/>
+      <w:pPr>
+        <w:tabs>
+          <w:tab w:val="num" w:pos="1440"/>
+        </w:tabs>
+        <w:ind w:left="1440" w:hanging="360"/>
+      </w:pPr>
+      <w:rPr>
+        <w:rFonts w:ascii="Courier New" w:hAnsi="Courier New" w:hint="default"/>
+        <w:sz w:val="20"/>
+      </w:rPr>
+    </w:lvl>
+    <w:lvl w:ilvl="2" w:tentative="1">
+      <w:start w:val="1"/>
+      <w:numFmt w:val="bullet"/>
+      <w:lvlText w:val=""/>
+      <w:lvlJc w:val="left"/>
+      <w:pPr>
+        <w:tabs>
+          <w:tab w:val="num" w:pos="2160"/>
+        </w:tabs>
+        <w:ind w:left="2160" w:hanging="360"/>
+      </w:pPr>
+      <w:rPr>
+        <w:rFonts w:ascii="Wingdings" w:hAnsi="Wingdings" w:hint="default"/>
+        <w:sz w:val="20"/>
+      </w:rPr>
+    </w:lvl>
+    <w:lvl w:ilvl="3" w:tentative="1">
+      <w:start w:val="1"/>
+      <w:numFmt w:val="bullet"/>
+      <w:lvlText w:val=""/>
+      <w:lvlJc w:val="left"/>
+      <w:pPr>
+        <w:tabs>
+          <w:tab w:val="num" w:pos="2880"/>
+        </w:tabs>
+        <w:ind w:left="2880" w:hanging="360"/>
+      </w:pPr>
+      <w:rPr>
+        <w:rFonts w:ascii="Wingdings" w:hAnsi="Wingdings" w:hint="default"/>
+        <w:sz w:val="20"/>
+      </w:rPr>
+    </w:lvl>
+    <w:lvl w:ilvl="4" w:tentative="1">
+      <w:start w:val="1"/>
+      <w:numFmt w:val="bullet"/>
+      <w:lvlText w:val=""/>
+      <w:lvlJc w:val="left"/>
+      <w:pPr>
+        <w:tabs>
+          <w:tab w:val="num" w:pos="3600"/>
+        </w:tabs>
+        <w:ind w:left="3600" w:hanging="360"/>
+      </w:pPr>
+      <w:rPr>
+        <w:rFonts w:ascii="Wingdings" w:hAnsi="Wingdings" w:hint="default"/>
+        <w:sz w:val="20"/>
+      </w:rPr>
+    </w:lvl>
+    <w:lvl w:ilvl="5" w:tentative="1">
+      <w:start w:val="1"/>
+      <w:numFmt w:val="bullet"/>
+      <w:lvlText w:val=""/>
+      <w:lvlJc w:val="left"/>
+      <w:pPr>
+        <w:tabs>
+          <w:tab w:val="num" w:pos="4320"/>
+        </w:tabs>
+        <w:ind w:left="4320" w:hanging="360"/>
+      </w:pPr>
+      <w:rPr>
+        <w:rFonts w:ascii="Wingdings" w:hAnsi="Wingdings" w:hint="default"/>
+        <w:sz w:val="20"/>
+      </w:rPr>
+    </w:lvl>
+    <w:lvl w:ilvl="6" w:tentative="1">
+      <w:start w:val="1"/>
+      <w:numFmt w:val="bullet"/>
+      <w:lvlText w:val=""/>
+      <w:lvlJc w:val="left"/>
+      <w:pPr>
+        <w:tabs>
+          <w:tab w:val="num" w:pos="5040"/>
+        </w:tabs>
+        <w:ind w:left="5040" w:hanging="360"/>
+      </w:pPr>
+      <w:rPr>
+        <w:rFonts w:ascii="Wingdings" w:hAnsi="Wingdings" w:hint="default"/>
+        <w:sz w:val="20"/>
+      </w:rPr>
+    </w:lvl>
+    <w:lvl w:ilvl="7" w:tentative="1">
+      <w:start w:val="1"/>
+      <w:numFmt w:val="bullet"/>
+      <w:lvlText w:val=""/>
+      <w:lvlJc w:val="left"/>
+      <w:pPr>
+        <w:tabs>
+          <w:tab w:val="num" w:pos="5760"/>
+        </w:tabs>
+        <w:ind w:left="5760" w:hanging="360"/>
+      </w:pPr>
+      <w:rPr>
+        <w:rFonts w:ascii="Wingdings" w:hAnsi="Wingdings" w:hint="default"/>
+        <w:sz w:val="20"/>
+      </w:rPr>
+    </w:lvl>
+    <w:lvl w:ilvl="8" w:tentative="1">
+      <w:start w:val="1"/>
+      <w:numFmt w:val="bullet"/>
+      <w:lvlText w:val=""/>
+      <w:lvlJc w:val="left"/>
+      <w:pPr>
+        <w:tabs>
+          <w:tab w:val="num" w:pos="6480"/>
+        </w:tabs>
+        <w:ind w:left="6480" w:hanging="360"/>
+      </w:pPr>
+      <w:rPr>
+        <w:rFonts w:ascii="Wingdings" w:hAnsi="Wingdings" w:hint="default"/>
+        <w:sz w:val="20"/>
+      </w:rPr>
+    </w:lvl>
+  </w:abstractNum>
   <w:num w:numId="1" w16cid:durableId="1467047595">
+    <w:abstractNumId w:val="2"/>
+  </w:num>
+  <w:num w:numId="2" w16cid:durableId="1694189657">
+    <w:abstractNumId w:val="5"/>
+  </w:num>
+  <w:num w:numId="3" w16cid:durableId="1925069259">
+    <w:abstractNumId w:val="3"/>
+  </w:num>
+  <w:num w:numId="4" w16cid:durableId="1608582718">
+    <w:abstractNumId w:val="6"/>
+  </w:num>
+  <w:num w:numId="5" w16cid:durableId="67465304">
+    <w:abstractNumId w:val="7"/>
+  </w:num>
+  <w:num w:numId="6" w16cid:durableId="1437167741">
+    <w:abstractNumId w:val="9"/>
+  </w:num>
+  <w:num w:numId="7" w16cid:durableId="70859093">
+    <w:abstractNumId w:val="4"/>
+  </w:num>
+  <w:num w:numId="8" w16cid:durableId="1585601565">
     <w:abstractNumId w:val="0"/>
   </w:num>
-  <w:num w:numId="2" w16cid:durableId="1694189657">
-    <w:abstractNumId w:val="2"/>
+  <w:num w:numId="9" w16cid:durableId="1430540130">
+    <w:abstractNumId w:val="11"/>
   </w:num>
-  <w:num w:numId="3" w16cid:durableId="1925069259">
+  <w:num w:numId="10" w16cid:durableId="1069423928">
+    <w:abstractNumId w:val="8"/>
+  </w:num>
+  <w:num w:numId="11" w16cid:durableId="155614167">
+    <w:abstractNumId w:val="12"/>
+  </w:num>
+  <w:num w:numId="12" w16cid:durableId="46493712">
+    <w:abstractNumId w:val="10"/>
+  </w:num>
+  <w:num w:numId="13" w16cid:durableId="171070051">
     <w:abstractNumId w:val="1"/>
-  </w:num>
-  <w:num w:numId="4" w16cid:durableId="1608582718">
-    <w:abstractNumId w:val="3"/>
-  </w:num>
-  <w:num w:numId="5" w16cid:durableId="67465304">
-    <w:abstractNumId w:val="4"/>
   </w:num>
 </w:numbering>
 </file>
@@ -1931,6 +4246,18 @@
       </w:tblBorders>
     </w:tblPr>
   </w:style>
+  <w:style w:type="character" w:styleId="UnresolvedMention">
+    <w:name w:val="Unresolved Mention"/>
+    <w:basedOn w:val="DefaultParagraphFont"/>
+    <w:uiPriority w:val="99"/>
+    <w:semiHidden/>
+    <w:unhideWhenUsed/>
+    <w:rsid w:val="00117F04"/>
+    <w:rPr>
+      <w:color w:val="605E5C"/>
+      <w:shd w:val="clear" w:color="auto" w:fill="E1DFDD"/>
+    </w:rPr>
+  </w:style>
 </w:styles>
 </file>
 

</xml_diff>

<commit_message>
All write ups just have CTFs remaining
</commit_message>
<xml_diff>
--- a/Portfolio/COMP6841_Week_5.docx
+++ b/Portfolio/COMP6841_Week_5.docx
@@ -91,7 +91,6 @@
           <w:color w:val="000000" w:themeColor="text1"/>
         </w:rPr>
       </w:pPr>
-      <w:proofErr w:type="gramStart"/>
       <w:r>
         <w:rPr>
           <w:rFonts w:ascii="Aptos" w:eastAsia="Aptos" w:hAnsi="Aptos" w:cs="Aptos"/>
@@ -108,17 +107,7 @@
           <w:bCs/>
           <w:color w:val="000000" w:themeColor="text1"/>
         </w:rPr>
-        <w:t>z</w:t>
-      </w:r>
-      <w:proofErr w:type="gramEnd"/>
-      <w:r>
-        <w:rPr>
-          <w:rFonts w:ascii="Aptos" w:eastAsia="Aptos" w:hAnsi="Aptos" w:cs="Aptos"/>
-          <w:b/>
-          <w:bCs/>
-          <w:color w:val="000000" w:themeColor="text1"/>
-        </w:rPr>
-        <w:t>5425064</w:t>
+        <w:t>z5425064</w:t>
       </w:r>
       <w:r>
         <w:rPr>
@@ -218,6 +207,7 @@
         <w:r>
           <w:rPr>
             <w:rStyle w:val="Hyperlink"/>
+            <w:highlight w:val="yellow"/>
           </w:rPr>
           <w:t>Security Everywhere</w:t>
         </w:r>
@@ -396,13 +386,8 @@
               <w:t xml:space="preserve">many devices without </w:t>
             </w:r>
             <w:r>
-              <w:t xml:space="preserve">relying on a </w:t>
-            </w:r>
-            <w:proofErr w:type="spellStart"/>
-            <w:r>
-              <w:t>centralised</w:t>
-            </w:r>
-            <w:proofErr w:type="spellEnd"/>
+              <w:t>relying on a centralised</w:t>
+            </w:r>
             <w:r>
               <w:t xml:space="preserve"> store of sensitive data.</w:t>
             </w:r>
@@ -538,11 +523,9 @@
             <w:r>
               <w:t xml:space="preserve">without </w:t>
             </w:r>
-            <w:proofErr w:type="spellStart"/>
             <w:r>
               <w:t>centralising</w:t>
             </w:r>
-            <w:proofErr w:type="spellEnd"/>
             <w:r>
               <w:t xml:space="preserve"> patient </w:t>
             </w:r>
@@ -766,15 +749,7 @@
               <w:t xml:space="preserve"> on user input patterns</w:t>
             </w:r>
             <w:r>
-              <w:t xml:space="preserve">, but keystroke data </w:t>
-            </w:r>
-            <w:proofErr w:type="gramStart"/>
-            <w:r>
-              <w:t>is</w:t>
-            </w:r>
-            <w:proofErr w:type="gramEnd"/>
-            <w:r>
-              <w:t xml:space="preserve"> highly sensitive and risky to store centrally. Federated learning </w:t>
+              <w:t xml:space="preserve">, but keystroke data is highly sensitive and risky to store centrally. Federated learning </w:t>
             </w:r>
             <w:r>
               <w:t>addresses</w:t>
@@ -792,15 +767,7 @@
               <w:t>,</w:t>
             </w:r>
             <w:r>
-              <w:t xml:space="preserve"> then </w:t>
-            </w:r>
-            <w:proofErr w:type="spellStart"/>
-            <w:r>
-              <w:t>personalising</w:t>
-            </w:r>
-            <w:proofErr w:type="spellEnd"/>
-            <w:r>
-              <w:t xml:space="preserve"> it for individual users without </w:t>
+              <w:t xml:space="preserve"> then personalising it for individual users without </w:t>
             </w:r>
             <w:r>
               <w:t>collecting</w:t>
@@ -845,15 +812,7 @@
               <w:t>about</w:t>
             </w:r>
             <w:r>
-              <w:t xml:space="preserve"> a target, such as an </w:t>
-            </w:r>
-            <w:proofErr w:type="spellStart"/>
-            <w:r>
-              <w:t>organisation</w:t>
-            </w:r>
-            <w:proofErr w:type="spellEnd"/>
-            <w:r>
-              <w:t xml:space="preserve">, individual, or business, without sending all collected intelligence </w:t>
+              <w:t xml:space="preserve"> a target, such as an organisation, individual, or business, without sending all collected intelligence </w:t>
             </w:r>
             <w:r>
               <w:t xml:space="preserve">to a central location. This could </w:t>
@@ -962,13 +921,8 @@
             </w:r>
           </w:p>
           <w:p>
-            <w:proofErr w:type="gramStart"/>
-            <w:r>
-              <w:t>Link :</w:t>
-            </w:r>
-            <w:proofErr w:type="gramEnd"/>
-            <w:r>
-              <w:t xml:space="preserve"> </w:t>
+            <w:r>
+              <w:t xml:space="preserve">Link : </w:t>
             </w:r>
             <w:hyperlink r:id="rId8" w:history="1">
               <w:r>
@@ -1023,8 +977,23 @@
         <w:r>
           <w:rPr>
             <w:rStyle w:val="Hyperlink"/>
+            <w:highlight w:val="yellow"/>
           </w:rPr>
-          <w:t>Where are you right now?</w:t>
+          <w:t>Where are y</w:t>
+        </w:r>
+        <w:r>
+          <w:rPr>
+            <w:rStyle w:val="Hyperlink"/>
+            <w:highlight w:val="yellow"/>
+          </w:rPr>
+          <w:t>o</w:t>
+        </w:r>
+        <w:r>
+          <w:rPr>
+            <w:rStyle w:val="Hyperlink"/>
+            <w:highlight w:val="yellow"/>
+          </w:rPr>
+          <w:t>u right now?</w:t>
         </w:r>
       </w:hyperlink>
     </w:p>
@@ -1045,16 +1014,234 @@
           <w:tcPr>
             <w:tcW w:w="9360" w:type="dxa"/>
           </w:tcPr>
+          <w:p>
+            <w:r>
+              <w:t xml:space="preserve">From </w:t>
+            </w:r>
+            <w:r>
+              <w:t xml:space="preserve">my </w:t>
+            </w:r>
+            <w:r>
+              <w:t>preliminary rese</w:t>
+            </w:r>
+            <w:r>
+              <w:t xml:space="preserve">arch, </w:t>
+            </w:r>
+            <w:r>
+              <w:t xml:space="preserve">one less obvious </w:t>
+            </w:r>
+            <w:r>
+              <w:t xml:space="preserve">method of </w:t>
+            </w:r>
+            <w:r>
+              <w:t xml:space="preserve">discreet </w:t>
+            </w:r>
+            <w:r>
+              <w:t>loc</w:t>
+            </w:r>
+            <w:r>
+              <w:t xml:space="preserve">ation tracking </w:t>
+            </w:r>
+            <w:r>
+              <w:t xml:space="preserve">is </w:t>
+            </w:r>
+            <w:r>
+              <w:t xml:space="preserve">through weather </w:t>
+            </w:r>
+            <w:r>
+              <w:t>apps</w:t>
+            </w:r>
+            <w:r>
+              <w:t xml:space="preserve"> rather than </w:t>
+            </w:r>
+            <w:r>
+              <w:t xml:space="preserve">mapping </w:t>
+            </w:r>
+            <w:r>
+              <w:t>or</w:t>
+            </w:r>
+            <w:r>
+              <w:t xml:space="preserve"> routing</w:t>
+            </w:r>
+            <w:r>
+              <w:t xml:space="preserve"> services.</w:t>
+            </w:r>
+            <w:r>
+              <w:t xml:space="preserve"> Th</w:t>
+            </w:r>
+            <w:r>
+              <w:t>is is beca</w:t>
+            </w:r>
+            <w:r>
+              <w:t xml:space="preserve">use </w:t>
+            </w:r>
+            <w:r>
+              <w:t>users reasonably expect a weather app to know their current location so it can provide an accurate forecast without requiring manual input each time. Apple’s Weather app states that location data is sent to Apple to request the correct forecast and is not associated with the user’s identity. While this appears privacy-friendly at first, there are further concerns.</w:t>
+            </w:r>
+          </w:p>
+          <w:p>
+            <w:r>
+              <w:t>The main</w:t>
+            </w:r>
+            <w:r>
+              <w:t xml:space="preserve"> concern is severe weather notifications. When enabled, this feature can use saved locations linked to an Apple account. If predictive location is also enabled, the app can estimate a user’s next location on-device and send those predictions to Apple </w:t>
+            </w:r>
+            <w:r>
+              <w:t>so it can</w:t>
+            </w:r>
+            <w:r>
+              <w:t xml:space="preserve"> provide relevant alerts. As a result, Apple may receive modelled movement patterns </w:t>
+            </w:r>
+            <w:r>
+              <w:t>connected to</w:t>
+            </w:r>
+            <w:r>
+              <w:t xml:space="preserve"> the user’s account, rather than only isolated location points.</w:t>
+            </w:r>
+            <w:r>
+              <w:t xml:space="preserve"> </w:t>
+            </w:r>
+            <w:r>
+              <w:t>Although Apple explains much of this on its privacy page, it does not clearly describe the potential harm that could result from this data. Consent is requested</w:t>
+            </w:r>
+            <w:r>
+              <w:t xml:space="preserve"> </w:t>
+            </w:r>
+            <w:r>
+              <w:t>when</w:t>
+            </w:r>
+            <w:r>
+              <w:t xml:space="preserve"> </w:t>
+            </w:r>
+            <w:r>
+              <w:t>the app</w:t>
+            </w:r>
+            <w:r>
+              <w:t xml:space="preserve"> is opened, but </w:t>
+            </w:r>
+            <w:r>
+              <w:t>the</w:t>
+            </w:r>
+            <w:r>
+              <w:t xml:space="preserve"> </w:t>
+            </w:r>
+            <w:r>
+              <w:t xml:space="preserve">difference between </w:t>
+            </w:r>
+            <w:r>
+              <w:t>enabling</w:t>
+            </w:r>
+            <w:r>
+              <w:t xml:space="preserve"> automated notifications and </w:t>
+            </w:r>
+            <w:r>
+              <w:t>using</w:t>
+            </w:r>
+            <w:r>
+              <w:t xml:space="preserve"> a standard </w:t>
+            </w:r>
+            <w:r>
+              <w:t>location list is not made especially clear. The added risk of having movement patterns analysed and transmitted is also not fully explained. Users</w:t>
+            </w:r>
+            <w:r>
+              <w:t xml:space="preserve"> can opt out</w:t>
+            </w:r>
+            <w:r>
+              <w:t>, but doing so removes</w:t>
+            </w:r>
+            <w:r>
+              <w:t xml:space="preserve"> severe w</w:t>
+            </w:r>
+            <w:r>
+              <w:t xml:space="preserve">eather notifications or </w:t>
+            </w:r>
+            <w:r>
+              <w:t>requires locations to be added</w:t>
+            </w:r>
+            <w:r>
+              <w:t xml:space="preserve"> manually</w:t>
+            </w:r>
+            <w:r>
+              <w:t>.</w:t>
+            </w:r>
+            <w:r>
+              <w:t xml:space="preserve"> This can be </w:t>
+            </w:r>
+            <w:r>
+              <w:t>inconvenient</w:t>
+            </w:r>
+            <w:r>
+              <w:t>, espec</w:t>
+            </w:r>
+            <w:r>
+              <w:t xml:space="preserve">ially </w:t>
+            </w:r>
+            <w:r>
+              <w:t>during</w:t>
+            </w:r>
+            <w:r>
+              <w:t xml:space="preserve"> </w:t>
+            </w:r>
+            <w:r>
+              <w:t>Australian</w:t>
+            </w:r>
+            <w:r>
+              <w:t xml:space="preserve"> </w:t>
+            </w:r>
+            <w:r>
+              <w:t xml:space="preserve">summers </w:t>
+            </w:r>
+            <w:r>
+              <w:t>when</w:t>
+            </w:r>
+            <w:r>
+              <w:t xml:space="preserve"> </w:t>
+            </w:r>
+            <w:r>
+              <w:t xml:space="preserve">events such as </w:t>
+            </w:r>
+            <w:r>
+              <w:t>ha</w:t>
+            </w:r>
+            <w:r>
+              <w:t xml:space="preserve">il </w:t>
+            </w:r>
+            <w:r>
+              <w:t xml:space="preserve">can </w:t>
+            </w:r>
+            <w:r>
+              <w:t xml:space="preserve">cause </w:t>
+            </w:r>
+            <w:r>
+              <w:t>urgent efforts</w:t>
+            </w:r>
+            <w:r>
+              <w:t xml:space="preserve"> to </w:t>
+            </w:r>
+            <w:r>
+              <w:t>protect vehicles.</w:t>
+            </w:r>
+            <w:r>
+              <w:t xml:space="preserve"> Whilst you are able to opt out from being tracked by them you also loose are significant amount of convenience. </w:t>
+            </w:r>
+          </w:p>
           <w:p/>
-          <w:p/>
-          <w:p/>
-          <w:p/>
-          <w:p/>
-          <w:p/>
-          <w:p/>
-          <w:p/>
-          <w:p/>
-          <w:p/>
+          <w:p>
+            <w:r>
+              <w:t xml:space="preserve">Link: </w:t>
+            </w:r>
+            <w:hyperlink r:id="rId10" w:history="1">
+              <w:r>
+                <w:rPr>
+                  <w:rStyle w:val="Hyperlink"/>
+                </w:rPr>
+                <w:t>https://www.apple.com/au/legal/privacy/data/en/weather/</w:t>
+              </w:r>
+            </w:hyperlink>
+            <w:r>
+              <w:t xml:space="preserve"> </w:t>
+            </w:r>
+          </w:p>
           <w:p>
             <w:pPr>
               <w:rPr>
@@ -1077,10 +1264,11 @@
         <w:pStyle w:val="Heading2"/>
         <w:spacing w:before="0" w:after="160"/>
       </w:pPr>
-      <w:hyperlink r:id="rId10">
+      <w:hyperlink r:id="rId11">
         <w:r>
           <w:rPr>
             <w:rStyle w:val="Hyperlink"/>
+            <w:highlight w:val="green"/>
           </w:rPr>
           <w:t>Password hash cracking</w:t>
         </w:r>
@@ -1103,12 +1291,55 @@
           <w:tcPr>
             <w:tcW w:w="9360" w:type="dxa"/>
           </w:tcPr>
-          <w:p/>
-          <w:p/>
-          <w:p/>
-          <w:p/>
-          <w:p/>
-          <w:p/>
+          <w:p>
+            <w:r>
+              <w:rPr>
+                <w:b/>
+                <w:bCs/>
+              </w:rPr>
+              <w:t>Dictionary Attack:</w:t>
+            </w:r>
+            <w:r>
+              <w:t xml:space="preserve"> An algorithm runs through a list of common words, passwords, and leaked credentials, hashes each one, and compares them against the target hashes. Any matches reveal the password and can reduce the search space for further brute-force attacks.</w:t>
+            </w:r>
+          </w:p>
+          <w:p>
+            <w:r>
+              <w:rPr>
+                <w:b/>
+                <w:bCs/>
+              </w:rPr>
+              <w:t>Rainbow/Lookup Table Attack:</w:t>
+            </w:r>
+            <w:r>
+              <w:t xml:space="preserve"> An attacker uses a precomputed table of common passwords and their corresponding hashes. If a stored password hash matches an entry in the table, the original password can be recovered almost instantly, provided the hash is not protected with a unique salt.</w:t>
+            </w:r>
+          </w:p>
+          <w:p>
+            <w:r>
+              <w:rPr>
+                <w:b/>
+                <w:bCs/>
+              </w:rPr>
+              <w:lastRenderedPageBreak/>
+              <w:t>Birthday Attack:</w:t>
+            </w:r>
+            <w:r>
+              <w:t xml:space="preserve"> This attack exploits the birthday paradox, where finding two different inputs that produce the same hash (a collision) is much more computationally feasible than trying to find a specific input for a given hash.</w:t>
+            </w:r>
+          </w:p>
+          <w:p>
+            <w:r>
+              <w:rPr>
+                <w:b/>
+                <w:bCs/>
+              </w:rPr>
+              <w:t>Chosen-Plaintext Attack:</w:t>
+            </w:r>
+            <w:r>
+              <w:t xml:space="preserve"> The attacker deliberately chooses plaintext messages and observes their corresponding ciphertexts. By analysing the relationship between the plaintexts and ciphertexts, they can infer properties of the encryption algorithm or, in some cases, recover the encryption key.</w:t>
+            </w:r>
+          </w:p>
           <w:p/>
           <w:p/>
           <w:p>
@@ -1117,6 +1348,223 @@
                 <w:rFonts w:ascii="Aptos" w:eastAsia="Aptos" w:hAnsi="Aptos" w:cs="Aptos"/>
               </w:rPr>
             </w:pPr>
+            <w:r>
+              <w:rPr>
+                <w:rFonts w:ascii="Aptos" w:eastAsia="Aptos" w:hAnsi="Aptos" w:cs="Aptos"/>
+              </w:rPr>
+              <w:t xml:space="preserve">Hash: </w:t>
+            </w:r>
+            <w:r>
+              <w:rPr>
+                <w:rFonts w:ascii="Aptos" w:eastAsia="Aptos" w:hAnsi="Aptos" w:cs="Aptos"/>
+              </w:rPr>
+              <w:t>482c811da5d5b4bc6d497ffa98491e38</w:t>
+            </w:r>
+          </w:p>
+          <w:p>
+            <w:pPr>
+              <w:pStyle w:val="ListParagraph"/>
+              <w:numPr>
+                <w:ilvl w:val="0"/>
+                <w:numId w:val="14"/>
+              </w:numPr>
+              <w:rPr>
+                <w:rFonts w:ascii="Aptos" w:eastAsia="Aptos" w:hAnsi="Aptos" w:cs="Aptos"/>
+              </w:rPr>
+            </w:pPr>
+            <w:r>
+              <w:rPr>
+                <w:rFonts w:ascii="Aptos" w:eastAsia="Aptos" w:hAnsi="Aptos" w:cs="Aptos"/>
+              </w:rPr>
+              <w:t>Google the internet with the has and look for any corresponding password</w:t>
+            </w:r>
+          </w:p>
+          <w:p>
+            <w:pPr>
+              <w:pStyle w:val="ListParagraph"/>
+              <w:numPr>
+                <w:ilvl w:val="0"/>
+                <w:numId w:val="14"/>
+              </w:numPr>
+              <w:rPr>
+                <w:rFonts w:ascii="Aptos" w:eastAsia="Aptos" w:hAnsi="Aptos" w:cs="Aptos"/>
+              </w:rPr>
+            </w:pPr>
+            <w:r>
+              <w:rPr>
+                <w:rFonts w:ascii="Aptos" w:eastAsia="Aptos" w:hAnsi="Aptos" w:cs="Aptos"/>
+              </w:rPr>
+              <w:t>I used the dictionary attack to solve this one</w:t>
+            </w:r>
+          </w:p>
+          <w:p>
+            <w:pPr>
+              <w:rPr>
+                <w:rFonts w:ascii="Aptos" w:eastAsia="Aptos" w:hAnsi="Aptos" w:cs="Aptos"/>
+              </w:rPr>
+            </w:pPr>
+          </w:p>
+          <w:p>
+            <w:pPr>
+              <w:rPr>
+                <w:rFonts w:ascii="Aptos" w:eastAsia="Aptos" w:hAnsi="Aptos" w:cs="Aptos"/>
+                <w:b/>
+                <w:bCs/>
+              </w:rPr>
+            </w:pPr>
+            <w:r>
+              <w:rPr>
+                <w:rFonts w:ascii="Aptos" w:eastAsia="Aptos" w:hAnsi="Aptos" w:cs="Aptos"/>
+                <w:b/>
+                <w:bCs/>
+              </w:rPr>
+              <w:t>My Challenge:</w:t>
+            </w:r>
+          </w:p>
+          <w:p>
+            <w:pPr>
+              <w:rPr>
+                <w:rFonts w:ascii="Aptos" w:eastAsia="Aptos" w:hAnsi="Aptos" w:cs="Aptos"/>
+                <w:b/>
+                <w:bCs/>
+              </w:rPr>
+            </w:pPr>
+            <w:r>
+              <w:rPr>
+                <w:rFonts w:ascii="Aptos" w:eastAsia="Aptos" w:hAnsi="Aptos" w:cs="Aptos"/>
+                <w:b/>
+                <w:bCs/>
+              </w:rPr>
+              <w:t>38af192699b32d180ae79d6a30a31343</w:t>
+            </w:r>
+          </w:p>
+          <w:p>
+            <w:pPr>
+              <w:pStyle w:val="ListParagraph"/>
+              <w:numPr>
+                <w:ilvl w:val="0"/>
+                <w:numId w:val="14"/>
+              </w:numPr>
+              <w:rPr>
+                <w:rFonts w:ascii="Aptos" w:eastAsia="Aptos" w:hAnsi="Aptos" w:cs="Aptos"/>
+                <w:b/>
+                <w:bCs/>
+              </w:rPr>
+            </w:pPr>
+            <w:r>
+              <w:rPr>
+                <w:rFonts w:ascii="Aptos" w:eastAsia="Aptos" w:hAnsi="Aptos" w:cs="Aptos"/>
+              </w:rPr>
+              <w:t>Solution: Shrek26</w:t>
+            </w:r>
+          </w:p>
+          <w:p>
+            <w:pPr>
+              <w:pStyle w:val="ListParagraph"/>
+              <w:numPr>
+                <w:ilvl w:val="0"/>
+                <w:numId w:val="14"/>
+              </w:numPr>
+              <w:rPr>
+                <w:rFonts w:ascii="Aptos" w:eastAsia="Aptos" w:hAnsi="Aptos" w:cs="Aptos"/>
+              </w:rPr>
+            </w:pPr>
+            <w:r>
+              <w:rPr>
+                <w:rFonts w:ascii="Aptos" w:eastAsia="Aptos" w:hAnsi="Aptos" w:cs="Aptos"/>
+              </w:rPr>
+              <w:t xml:space="preserve">Hint: </w:t>
+            </w:r>
+            <w:r>
+              <w:rPr>
+                <w:rFonts w:ascii="Aptos" w:eastAsia="Aptos" w:hAnsi="Aptos" w:cs="Aptos"/>
+              </w:rPr>
+              <w:t>Great kids movie with a green character + this year</w:t>
+            </w:r>
+          </w:p>
+          <w:p>
+            <w:pPr>
+              <w:rPr>
+                <w:rFonts w:ascii="Aptos" w:eastAsia="Aptos" w:hAnsi="Aptos" w:cs="Aptos"/>
+                <w:b/>
+                <w:bCs/>
+              </w:rPr>
+            </w:pPr>
+            <w:r>
+              <w:rPr>
+                <w:rFonts w:ascii="Aptos" w:eastAsia="Aptos" w:hAnsi="Aptos" w:cs="Aptos"/>
+                <w:b/>
+                <w:bCs/>
+              </w:rPr>
+              <w:t>Students Challenge:</w:t>
+            </w:r>
+          </w:p>
+          <w:p>
+            <w:pPr>
+              <w:rPr>
+                <w:rFonts w:ascii="Aptos" w:eastAsia="Aptos" w:hAnsi="Aptos" w:cs="Aptos"/>
+                <w:b/>
+                <w:bCs/>
+              </w:rPr>
+            </w:pPr>
+            <w:r>
+              <w:rPr>
+                <w:rFonts w:ascii="Aptos" w:eastAsia="Aptos" w:hAnsi="Aptos" w:cs="Aptos"/>
+                <w:b/>
+                <w:bCs/>
+              </w:rPr>
+              <w:t>e3036e07f6d65e1ca168135c409cb046</w:t>
+            </w:r>
+            <w:r>
+              <w:rPr>
+                <w:rFonts w:ascii="Aptos" w:eastAsia="Aptos" w:hAnsi="Aptos" w:cs="Aptos"/>
+                <w:b/>
+                <w:bCs/>
+              </w:rPr>
+              <w:t>:</w:t>
+            </w:r>
+          </w:p>
+          <w:p>
+            <w:pPr>
+              <w:pStyle w:val="ListParagraph"/>
+              <w:numPr>
+                <w:ilvl w:val="0"/>
+                <w:numId w:val="14"/>
+              </w:numPr>
+              <w:rPr>
+                <w:rFonts w:ascii="Aptos" w:eastAsia="Aptos" w:hAnsi="Aptos" w:cs="Aptos"/>
+              </w:rPr>
+            </w:pPr>
+            <w:r>
+              <w:rPr>
+                <w:rFonts w:ascii="Aptos" w:eastAsia="Aptos" w:hAnsi="Aptos" w:cs="Aptos"/>
+              </w:rPr>
+              <w:t xml:space="preserve">Solution: </w:t>
+            </w:r>
+            <w:r>
+              <w:rPr>
+                <w:rFonts w:ascii="Aptos" w:eastAsia="Aptos" w:hAnsi="Aptos" w:cs="Aptos"/>
+              </w:rPr>
+              <w:t>privacy2026</w:t>
+            </w:r>
+          </w:p>
+          <w:p>
+            <w:pPr>
+              <w:pStyle w:val="ListParagraph"/>
+              <w:numPr>
+                <w:ilvl w:val="0"/>
+                <w:numId w:val="14"/>
+              </w:numPr>
+              <w:rPr>
+                <w:rFonts w:ascii="Aptos" w:eastAsia="Aptos" w:hAnsi="Aptos" w:cs="Aptos"/>
+              </w:rPr>
+            </w:pPr>
+            <w:r>
+              <w:rPr>
+                <w:rFonts w:ascii="Aptos" w:eastAsia="Aptos" w:hAnsi="Aptos" w:cs="Aptos"/>
+              </w:rPr>
+              <w:t>From the hit I found a few cipher text extractions and found a pattern relating to length and letters and when close I then adjusted a few combinations of the password.</w:t>
+            </w:r>
           </w:p>
         </w:tc>
       </w:tr>
@@ -1133,10 +1581,11 @@
         <w:pStyle w:val="Heading2"/>
         <w:spacing w:before="0" w:after="160"/>
       </w:pPr>
-      <w:hyperlink r:id="rId11">
+      <w:hyperlink r:id="rId12">
         <w:r>
           <w:rPr>
             <w:rStyle w:val="Hyperlink"/>
+            <w:highlight w:val="green"/>
           </w:rPr>
           <w:t>Bitcoin mining</w:t>
         </w:r>
@@ -1160,12 +1609,84 @@
             <w:tcW w:w="9360" w:type="dxa"/>
           </w:tcPr>
           <w:p/>
+          <w:p>
+            <w:pPr>
+              <w:pStyle w:val="ListParagraph"/>
+              <w:numPr>
+                <w:ilvl w:val="0"/>
+                <w:numId w:val="15"/>
+              </w:numPr>
+            </w:pPr>
+            <w:r>
+              <w:t xml:space="preserve">I tried both the openssl and online approach to generate a hash. </w:t>
+            </w:r>
+          </w:p>
+          <w:p>
+            <w:pPr>
+              <w:pStyle w:val="ListParagraph"/>
+              <w:numPr>
+                <w:ilvl w:val="0"/>
+                <w:numId w:val="15"/>
+              </w:numPr>
+            </w:pPr>
+            <w:r>
+              <w:t>First you take the hash of the previous valid block in the chain and include it in your plaintext</w:t>
+            </w:r>
+          </w:p>
+          <w:p>
+            <w:pPr>
+              <w:pStyle w:val="ListParagraph"/>
+              <w:numPr>
+                <w:ilvl w:val="0"/>
+                <w:numId w:val="15"/>
+              </w:numPr>
+            </w:pPr>
+            <w:r>
+              <w:t xml:space="preserve">Then find iteratively encrypt with different serial numbers to </w:t>
+            </w:r>
+            <w:r>
+              <w:t>find a match which fits the  given criteria.</w:t>
+            </w:r>
+          </w:p>
+          <w:p>
+            <w:pPr>
+              <w:pStyle w:val="ListParagraph"/>
+              <w:numPr>
+                <w:ilvl w:val="0"/>
+                <w:numId w:val="15"/>
+              </w:numPr>
+            </w:pPr>
+            <w:r>
+              <w:t>Longest chain is considered most valid</w:t>
+            </w:r>
+          </w:p>
           <w:p/>
-          <w:p/>
-          <w:p/>
-          <w:p/>
-          <w:p/>
-          <w:p/>
+          <w:p>
+            <w:pPr>
+              <w:rPr>
+                <w:lang w:val="en-AU"/>
+              </w:rPr>
+            </w:pPr>
+            <w:r>
+              <w:rPr>
+                <w:lang w:val="en-AU"/>
+              </w:rPr>
+              <w:t>Block:87+ASD+0eff2ecd2ae2a2c5f9f0f3760cf948f74a378199468c1bc1e090df17ba144285+6</w:t>
+            </w:r>
+          </w:p>
+          <w:p>
+            <w:pPr>
+              <w:rPr>
+                <w:lang w:val="en-AU"/>
+              </w:rPr>
+            </w:pPr>
+            <w:r>
+              <w:rPr>
+                <w:lang w:val="en-AU"/>
+              </w:rPr>
+              <w:t>Hash: 0218a17ed51e68e993b47deffa2a8ea8068ed982f561ba7afca3adfdc703ac44</w:t>
+            </w:r>
+          </w:p>
           <w:p/>
           <w:p/>
           <w:p/>
@@ -1195,6 +1716,7 @@
           <w:b/>
           <w:bCs/>
         </w:rPr>
+        <w:lastRenderedPageBreak/>
         <w:t>Exten</w:t>
       </w:r>
       <w:r>
@@ -1217,7 +1739,7 @@
           <w:szCs w:val="32"/>
         </w:rPr>
       </w:pPr>
-      <w:hyperlink r:id="rId12">
+      <w:hyperlink r:id="rId13">
         <w:r>
           <w:rPr>
             <w:rStyle w:val="Hyperlink"/>
@@ -1280,7 +1802,7 @@
       <w:pPr>
         <w:pStyle w:val="Heading2"/>
       </w:pPr>
-      <w:hyperlink r:id="rId13">
+      <w:hyperlink r:id="rId14">
         <w:r>
           <w:rPr>
             <w:rStyle w:val="Hyperlink"/>
@@ -1315,39 +1837,7 @@
           <w:p/>
           <w:p>
             <w:r>
-              <w:t xml:space="preserve">During this </w:t>
-            </w:r>
-            <w:proofErr w:type="gramStart"/>
-            <w:r>
-              <w:t>weeks</w:t>
-            </w:r>
-            <w:proofErr w:type="gramEnd"/>
-            <w:r>
-              <w:t xml:space="preserve"> tutorial </w:t>
-            </w:r>
-            <w:proofErr w:type="gramStart"/>
-            <w:r>
-              <w:t>discussion</w:t>
-            </w:r>
-            <w:proofErr w:type="gramEnd"/>
-            <w:r>
-              <w:t xml:space="preserve"> we primarily discussed the topic of privacy and data collection in Australia. We had to have a debate regarding whether ever person in Australia could have </w:t>
-            </w:r>
-            <w:proofErr w:type="gramStart"/>
-            <w:r>
-              <w:t>all of</w:t>
-            </w:r>
-            <w:proofErr w:type="gramEnd"/>
-            <w:r>
-              <w:t xml:space="preserve"> their data collected by governments. I was an adjudicator of the debate and hence was able to </w:t>
-            </w:r>
-            <w:proofErr w:type="gramStart"/>
-            <w:r>
-              <w:t>here</w:t>
-            </w:r>
-            <w:proofErr w:type="gramEnd"/>
-            <w:r>
-              <w:t xml:space="preserve"> both sides.</w:t>
+              <w:t>During this weeks tutorial discussion we primarily discussed the topic of privacy and data collection in Australia. We had to have a debate regarding whether ever person in Australia could have all of their data collected by governments. I was an adjudicator of the debate and hence was able to here both sides.</w:t>
             </w:r>
             <w:r>
               <w:t xml:space="preserve"> There were many points I agreed and disagreed</w:t>
@@ -1376,7 +1866,6 @@
                 <w:u w:val="single"/>
               </w:rPr>
             </w:pPr>
-            <w:proofErr w:type="gramStart"/>
             <w:r>
               <w:rPr>
                 <w:b/>
@@ -1385,7 +1874,6 @@
               </w:rPr>
               <w:t>For :</w:t>
             </w:r>
-            <w:proofErr w:type="gramEnd"/>
           </w:p>
           <w:p>
             <w:pPr>
@@ -1453,15 +1941,7 @@
               </w:numPr>
             </w:pPr>
             <w:r>
-              <w:t xml:space="preserve">Not all should be collected because how could the security and safety of people in roles such as intelligent operatives and undercover police workers remain safe and effective with </w:t>
-            </w:r>
-            <w:proofErr w:type="gramStart"/>
-            <w:r>
-              <w:t>such</w:t>
-            </w:r>
-            <w:proofErr w:type="gramEnd"/>
-            <w:r>
-              <w:t xml:space="preserve"> knowledge collected about them. This would create a critical flaw and a new attack vector.</w:t>
+              <w:t>Not all should be collected because how could the security and safety of people in roles such as intelligent operatives and undercover police workers remain safe and effective with such knowledge collected about them. This would create a critical flaw and a new attack vector.</w:t>
             </w:r>
           </w:p>
           <w:p>
@@ -1473,7 +1953,6 @@
               </w:numPr>
             </w:pPr>
             <w:r>
-              <w:lastRenderedPageBreak/>
               <w:t xml:space="preserve">Future governments cannot be trusted. </w:t>
             </w:r>
             <w:r>
@@ -1487,6 +1966,7 @@
           </w:p>
           <w:p>
             <w:r>
+              <w:lastRenderedPageBreak/>
               <w:t>As the debate was carried out the following key points</w:t>
             </w:r>
             <w:r>
@@ -1521,31 +2001,7 @@
               </w:numPr>
             </w:pPr>
             <w:r>
-              <w:t xml:space="preserve">There </w:t>
-            </w:r>
-            <w:proofErr w:type="gramStart"/>
-            <w:r>
-              <w:t>is</w:t>
-            </w:r>
-            <w:proofErr w:type="gramEnd"/>
-            <w:r>
-              <w:t xml:space="preserve"> very little practical methods where the data of a criminal can be captured before the crime. Whilst I mostly agreed with this point, I disagreed with the fact that there are methods that can capture a lot of </w:t>
-            </w:r>
-            <w:proofErr w:type="gramStart"/>
-            <w:r>
-              <w:t>criminal</w:t>
-            </w:r>
-            <w:proofErr w:type="gramEnd"/>
-            <w:r>
-              <w:t xml:space="preserve"> from pattern matching methods. This could be where data is collected once the criminal falls within a confidence interval of prediction to commit future crimes (</w:t>
-            </w:r>
-            <w:proofErr w:type="spellStart"/>
-            <w:r>
-              <w:t>i.e</w:t>
-            </w:r>
-            <w:proofErr w:type="spellEnd"/>
-            <w:r>
-              <w:t xml:space="preserve"> a watch list). This would allow for data before many criminals commit their crimes. However, I also believe the ethics of such </w:t>
+              <w:t xml:space="preserve">There is very little practical methods where the data of a criminal can be captured before the crime. Whilst I mostly agreed with this point, I disagreed with the fact that there are methods that can capture a lot of criminal from pattern matching methods. This could be where data is collected once the criminal falls within a confidence interval of prediction to commit future crimes (i.e a watch list). This would allow for data before many criminals commit their crimes. However, I also believe the ethics of such </w:t>
             </w:r>
             <w:r>
               <w:t xml:space="preserve">a mechanism is questionable, since </w:t>
@@ -1581,7 +2037,6 @@
               </w:numPr>
               <w:spacing w:after="160" w:line="279" w:lineRule="auto"/>
             </w:pPr>
-            <w:proofErr w:type="gramStart"/>
             <w:r>
               <w:t xml:space="preserve">A </w:t>
             </w:r>
@@ -1592,11 +2047,7 @@
               <w:t>number</w:t>
             </w:r>
             <w:r>
-              <w:t xml:space="preserve"> of</w:t>
-            </w:r>
-            <w:proofErr w:type="gramEnd"/>
-            <w:r>
-              <w:t xml:space="preserve"> people </w:t>
+              <w:t xml:space="preserve"> of people </w:t>
             </w:r>
             <w:r>
               <w:t xml:space="preserve">are </w:t>
@@ -1904,31 +2355,100 @@
           </w:p>
           <w:p>
             <w:r>
-              <w:t xml:space="preserve">After the debate I mostly believed that the debate itself was </w:t>
-            </w:r>
-            <w:proofErr w:type="gramStart"/>
-            <w:r>
-              <w:t>week</w:t>
-            </w:r>
-            <w:proofErr w:type="gramEnd"/>
-            <w:r>
-              <w:t xml:space="preserve"> because neither side clearly defined the bounds of their debate. I found that each argument could have been extended to a more thorough analysis. </w:t>
-            </w:r>
-            <w:proofErr w:type="gramStart"/>
-            <w:r>
-              <w:t>However</w:t>
-            </w:r>
-            <w:proofErr w:type="gramEnd"/>
-            <w:r>
-              <w:t xml:space="preserve"> I found the Against team to be more convincing and </w:t>
-            </w:r>
-            <w:proofErr w:type="gramStart"/>
-            <w:r>
-              <w:t>produce</w:t>
-            </w:r>
-            <w:proofErr w:type="gramEnd"/>
-            <w:r>
-              <w:t xml:space="preserve"> a stronger argument. </w:t>
+              <w:t>After the deba</w:t>
+            </w:r>
+            <w:r>
+              <w:t>te</w:t>
+            </w:r>
+            <w:r>
+              <w:t>,</w:t>
+            </w:r>
+            <w:r>
+              <w:t xml:space="preserve"> I </w:t>
+            </w:r>
+            <w:r>
+              <w:t>felt it was weakened by the fact</w:t>
+            </w:r>
+            <w:r>
+              <w:t xml:space="preserve"> that </w:t>
+            </w:r>
+            <w:r>
+              <w:t>n</w:t>
+            </w:r>
+            <w:r>
+              <w:t xml:space="preserve">either </w:t>
+            </w:r>
+            <w:r>
+              <w:t>side clearly defined</w:t>
+            </w:r>
+            <w:r>
+              <w:t xml:space="preserve"> the </w:t>
+            </w:r>
+            <w:r>
+              <w:t>scope</w:t>
+            </w:r>
+            <w:r>
+              <w:t xml:space="preserve"> of </w:t>
+            </w:r>
+            <w:r>
+              <w:t xml:space="preserve">the issue. Many arguments </w:t>
+            </w:r>
+            <w:r>
+              <w:t xml:space="preserve">could have been </w:t>
+            </w:r>
+            <w:r>
+              <w:t>developed into</w:t>
+            </w:r>
+            <w:r>
+              <w:t xml:space="preserve"> </w:t>
+            </w:r>
+            <w:r>
+              <w:t xml:space="preserve">a more </w:t>
+            </w:r>
+            <w:r>
+              <w:t>detailed</w:t>
+            </w:r>
+            <w:r>
+              <w:t xml:space="preserve"> analysis</w:t>
+            </w:r>
+            <w:r>
+              <w:t>.</w:t>
+            </w:r>
+            <w:r>
+              <w:t xml:space="preserve"> </w:t>
+            </w:r>
+            <w:r>
+              <w:t>Howeve</w:t>
+            </w:r>
+            <w:r>
+              <w:t>r</w:t>
+            </w:r>
+            <w:r>
+              <w:t>,</w:t>
+            </w:r>
+            <w:r>
+              <w:t xml:space="preserve"> I fou</w:t>
+            </w:r>
+            <w:r>
+              <w:t xml:space="preserve">nd the Against team </w:t>
+            </w:r>
+            <w:r>
+              <w:t>more convinc</w:t>
+            </w:r>
+            <w:r>
+              <w:t xml:space="preserve">ing </w:t>
+            </w:r>
+            <w:r>
+              <w:t>overall, as their argument was</w:t>
+            </w:r>
+            <w:r>
+              <w:t xml:space="preserve"> </w:t>
+            </w:r>
+            <w:r>
+              <w:t xml:space="preserve">stronger </w:t>
+            </w:r>
+            <w:r>
+              <w:t>and better supported.</w:t>
             </w:r>
           </w:p>
         </w:tc>
@@ -2131,6 +2651,119 @@
     </w:lvl>
   </w:abstractNum>
   <w:abstractNum w:abstractNumId="1" w15:restartNumberingAfterBreak="0">
+    <w:nsid w:val="1C1E7317"/>
+    <w:multiLevelType w:val="hybridMultilevel"/>
+    <w:tmpl w:val="94261B7A"/>
+    <w:lvl w:ilvl="0" w:tplc="E9A02068">
+      <w:start w:val="1"/>
+      <w:numFmt w:val="bullet"/>
+      <w:lvlText w:val=""/>
+      <w:lvlJc w:val="left"/>
+      <w:pPr>
+        <w:ind w:left="720" w:hanging="360"/>
+      </w:pPr>
+      <w:rPr>
+        <w:rFonts w:ascii="Symbol" w:eastAsiaTheme="minorEastAsia" w:hAnsi="Symbol" w:cstheme="minorBidi" w:hint="default"/>
+      </w:rPr>
+    </w:lvl>
+    <w:lvl w:ilvl="1" w:tplc="0C090003" w:tentative="1">
+      <w:start w:val="1"/>
+      <w:numFmt w:val="bullet"/>
+      <w:lvlText w:val="o"/>
+      <w:lvlJc w:val="left"/>
+      <w:pPr>
+        <w:ind w:left="1440" w:hanging="360"/>
+      </w:pPr>
+      <w:rPr>
+        <w:rFonts w:ascii="Courier New" w:hAnsi="Courier New" w:cs="Courier New" w:hint="default"/>
+      </w:rPr>
+    </w:lvl>
+    <w:lvl w:ilvl="2" w:tplc="0C090005" w:tentative="1">
+      <w:start w:val="1"/>
+      <w:numFmt w:val="bullet"/>
+      <w:lvlText w:val=""/>
+      <w:lvlJc w:val="left"/>
+      <w:pPr>
+        <w:ind w:left="2160" w:hanging="360"/>
+      </w:pPr>
+      <w:rPr>
+        <w:rFonts w:ascii="Wingdings" w:hAnsi="Wingdings" w:hint="default"/>
+      </w:rPr>
+    </w:lvl>
+    <w:lvl w:ilvl="3" w:tplc="0C090001" w:tentative="1">
+      <w:start w:val="1"/>
+      <w:numFmt w:val="bullet"/>
+      <w:lvlText w:val=""/>
+      <w:lvlJc w:val="left"/>
+      <w:pPr>
+        <w:ind w:left="2880" w:hanging="360"/>
+      </w:pPr>
+      <w:rPr>
+        <w:rFonts w:ascii="Symbol" w:hAnsi="Symbol" w:hint="default"/>
+      </w:rPr>
+    </w:lvl>
+    <w:lvl w:ilvl="4" w:tplc="0C090003" w:tentative="1">
+      <w:start w:val="1"/>
+      <w:numFmt w:val="bullet"/>
+      <w:lvlText w:val="o"/>
+      <w:lvlJc w:val="left"/>
+      <w:pPr>
+        <w:ind w:left="3600" w:hanging="360"/>
+      </w:pPr>
+      <w:rPr>
+        <w:rFonts w:ascii="Courier New" w:hAnsi="Courier New" w:cs="Courier New" w:hint="default"/>
+      </w:rPr>
+    </w:lvl>
+    <w:lvl w:ilvl="5" w:tplc="0C090005" w:tentative="1">
+      <w:start w:val="1"/>
+      <w:numFmt w:val="bullet"/>
+      <w:lvlText w:val=""/>
+      <w:lvlJc w:val="left"/>
+      <w:pPr>
+        <w:ind w:left="4320" w:hanging="360"/>
+      </w:pPr>
+      <w:rPr>
+        <w:rFonts w:ascii="Wingdings" w:hAnsi="Wingdings" w:hint="default"/>
+      </w:rPr>
+    </w:lvl>
+    <w:lvl w:ilvl="6" w:tplc="0C090001" w:tentative="1">
+      <w:start w:val="1"/>
+      <w:numFmt w:val="bullet"/>
+      <w:lvlText w:val=""/>
+      <w:lvlJc w:val="left"/>
+      <w:pPr>
+        <w:ind w:left="5040" w:hanging="360"/>
+      </w:pPr>
+      <w:rPr>
+        <w:rFonts w:ascii="Symbol" w:hAnsi="Symbol" w:hint="default"/>
+      </w:rPr>
+    </w:lvl>
+    <w:lvl w:ilvl="7" w:tplc="0C090003" w:tentative="1">
+      <w:start w:val="1"/>
+      <w:numFmt w:val="bullet"/>
+      <w:lvlText w:val="o"/>
+      <w:lvlJc w:val="left"/>
+      <w:pPr>
+        <w:ind w:left="5760" w:hanging="360"/>
+      </w:pPr>
+      <w:rPr>
+        <w:rFonts w:ascii="Courier New" w:hAnsi="Courier New" w:cs="Courier New" w:hint="default"/>
+      </w:rPr>
+    </w:lvl>
+    <w:lvl w:ilvl="8" w:tplc="0C090005" w:tentative="1">
+      <w:start w:val="1"/>
+      <w:numFmt w:val="bullet"/>
+      <w:lvlText w:val=""/>
+      <w:lvlJc w:val="left"/>
+      <w:pPr>
+        <w:ind w:left="6480" w:hanging="360"/>
+      </w:pPr>
+      <w:rPr>
+        <w:rFonts w:ascii="Wingdings" w:hAnsi="Wingdings" w:hint="default"/>
+      </w:rPr>
+    </w:lvl>
+  </w:abstractNum>
+  <w:abstractNum w:abstractNumId="2" w15:restartNumberingAfterBreak="0">
     <w:nsid w:val="37A86F2C"/>
     <w:multiLevelType w:val="multilevel"/>
     <w:tmpl w:val="5ECE966C"/>
@@ -2279,7 +2912,7 @@
       </w:rPr>
     </w:lvl>
   </w:abstractNum>
-  <w:abstractNum w:abstractNumId="2" w15:restartNumberingAfterBreak="0">
+  <w:abstractNum w:abstractNumId="3" w15:restartNumberingAfterBreak="0">
     <w:nsid w:val="3C2F8207"/>
     <w:multiLevelType w:val="hybridMultilevel"/>
     <w:tmpl w:val="1E8C28C2"/>
@@ -2365,7 +2998,7 @@
       </w:pPr>
     </w:lvl>
   </w:abstractNum>
-  <w:abstractNum w:abstractNumId="3" w15:restartNumberingAfterBreak="0">
+  <w:abstractNum w:abstractNumId="4" w15:restartNumberingAfterBreak="0">
     <w:nsid w:val="44900513"/>
     <w:multiLevelType w:val="hybridMultilevel"/>
     <w:tmpl w:val="53F08F42"/>
@@ -2477,7 +3110,7 @@
       </w:rPr>
     </w:lvl>
   </w:abstractNum>
-  <w:abstractNum w:abstractNumId="4" w15:restartNumberingAfterBreak="0">
+  <w:abstractNum w:abstractNumId="5" w15:restartNumberingAfterBreak="0">
     <w:nsid w:val="44DB485B"/>
     <w:multiLevelType w:val="hybridMultilevel"/>
     <w:tmpl w:val="47E46DB0"/>
@@ -2566,7 +3199,7 @@
       </w:pPr>
     </w:lvl>
   </w:abstractNum>
-  <w:abstractNum w:abstractNumId="5" w15:restartNumberingAfterBreak="0">
+  <w:abstractNum w:abstractNumId="6" w15:restartNumberingAfterBreak="0">
     <w:nsid w:val="4923DB14"/>
     <w:multiLevelType w:val="hybridMultilevel"/>
     <w:tmpl w:val="8416CB06"/>
@@ -2652,7 +3285,7 @@
       </w:pPr>
     </w:lvl>
   </w:abstractNum>
-  <w:abstractNum w:abstractNumId="6" w15:restartNumberingAfterBreak="0">
+  <w:abstractNum w:abstractNumId="7" w15:restartNumberingAfterBreak="0">
     <w:nsid w:val="49EE04D4"/>
     <w:multiLevelType w:val="hybridMultilevel"/>
     <w:tmpl w:val="3814AC62"/>
@@ -2764,7 +3397,7 @@
       </w:rPr>
     </w:lvl>
   </w:abstractNum>
-  <w:abstractNum w:abstractNumId="7" w15:restartNumberingAfterBreak="0">
+  <w:abstractNum w:abstractNumId="8" w15:restartNumberingAfterBreak="0">
     <w:nsid w:val="4F2C1698"/>
     <w:multiLevelType w:val="multilevel"/>
     <w:tmpl w:val="D3AE4D18"/>
@@ -2913,7 +3546,7 @@
       </w:rPr>
     </w:lvl>
   </w:abstractNum>
-  <w:abstractNum w:abstractNumId="8" w15:restartNumberingAfterBreak="0">
+  <w:abstractNum w:abstractNumId="9" w15:restartNumberingAfterBreak="0">
     <w:nsid w:val="77264255"/>
     <w:multiLevelType w:val="multilevel"/>
     <w:tmpl w:val="FEB88570"/>
@@ -3062,7 +3695,120 @@
       </w:rPr>
     </w:lvl>
   </w:abstractNum>
-  <w:abstractNum w:abstractNumId="9" w15:restartNumberingAfterBreak="0">
+  <w:abstractNum w:abstractNumId="10" w15:restartNumberingAfterBreak="0">
+    <w:nsid w:val="7A4C1007"/>
+    <w:multiLevelType w:val="hybridMultilevel"/>
+    <w:tmpl w:val="6EB6C4C6"/>
+    <w:lvl w:ilvl="0" w:tplc="03AE77E0">
+      <w:start w:val="1"/>
+      <w:numFmt w:val="bullet"/>
+      <w:lvlText w:val="-"/>
+      <w:lvlJc w:val="left"/>
+      <w:pPr>
+        <w:ind w:left="720" w:hanging="360"/>
+      </w:pPr>
+      <w:rPr>
+        <w:rFonts w:ascii="Aptos" w:eastAsia="Aptos" w:hAnsi="Aptos" w:cs="Aptos" w:hint="default"/>
+      </w:rPr>
+    </w:lvl>
+    <w:lvl w:ilvl="1" w:tplc="0C090003" w:tentative="1">
+      <w:start w:val="1"/>
+      <w:numFmt w:val="bullet"/>
+      <w:lvlText w:val="o"/>
+      <w:lvlJc w:val="left"/>
+      <w:pPr>
+        <w:ind w:left="1440" w:hanging="360"/>
+      </w:pPr>
+      <w:rPr>
+        <w:rFonts w:ascii="Courier New" w:hAnsi="Courier New" w:cs="Courier New" w:hint="default"/>
+      </w:rPr>
+    </w:lvl>
+    <w:lvl w:ilvl="2" w:tplc="0C090005" w:tentative="1">
+      <w:start w:val="1"/>
+      <w:numFmt w:val="bullet"/>
+      <w:lvlText w:val=""/>
+      <w:lvlJc w:val="left"/>
+      <w:pPr>
+        <w:ind w:left="2160" w:hanging="360"/>
+      </w:pPr>
+      <w:rPr>
+        <w:rFonts w:ascii="Wingdings" w:hAnsi="Wingdings" w:hint="default"/>
+      </w:rPr>
+    </w:lvl>
+    <w:lvl w:ilvl="3" w:tplc="0C090001" w:tentative="1">
+      <w:start w:val="1"/>
+      <w:numFmt w:val="bullet"/>
+      <w:lvlText w:val=""/>
+      <w:lvlJc w:val="left"/>
+      <w:pPr>
+        <w:ind w:left="2880" w:hanging="360"/>
+      </w:pPr>
+      <w:rPr>
+        <w:rFonts w:ascii="Symbol" w:hAnsi="Symbol" w:hint="default"/>
+      </w:rPr>
+    </w:lvl>
+    <w:lvl w:ilvl="4" w:tplc="0C090003" w:tentative="1">
+      <w:start w:val="1"/>
+      <w:numFmt w:val="bullet"/>
+      <w:lvlText w:val="o"/>
+      <w:lvlJc w:val="left"/>
+      <w:pPr>
+        <w:ind w:left="3600" w:hanging="360"/>
+      </w:pPr>
+      <w:rPr>
+        <w:rFonts w:ascii="Courier New" w:hAnsi="Courier New" w:cs="Courier New" w:hint="default"/>
+      </w:rPr>
+    </w:lvl>
+    <w:lvl w:ilvl="5" w:tplc="0C090005" w:tentative="1">
+      <w:start w:val="1"/>
+      <w:numFmt w:val="bullet"/>
+      <w:lvlText w:val=""/>
+      <w:lvlJc w:val="left"/>
+      <w:pPr>
+        <w:ind w:left="4320" w:hanging="360"/>
+      </w:pPr>
+      <w:rPr>
+        <w:rFonts w:ascii="Wingdings" w:hAnsi="Wingdings" w:hint="default"/>
+      </w:rPr>
+    </w:lvl>
+    <w:lvl w:ilvl="6" w:tplc="0C090001" w:tentative="1">
+      <w:start w:val="1"/>
+      <w:numFmt w:val="bullet"/>
+      <w:lvlText w:val=""/>
+      <w:lvlJc w:val="left"/>
+      <w:pPr>
+        <w:ind w:left="5040" w:hanging="360"/>
+      </w:pPr>
+      <w:rPr>
+        <w:rFonts w:ascii="Symbol" w:hAnsi="Symbol" w:hint="default"/>
+      </w:rPr>
+    </w:lvl>
+    <w:lvl w:ilvl="7" w:tplc="0C090003" w:tentative="1">
+      <w:start w:val="1"/>
+      <w:numFmt w:val="bullet"/>
+      <w:lvlText w:val="o"/>
+      <w:lvlJc w:val="left"/>
+      <w:pPr>
+        <w:ind w:left="5760" w:hanging="360"/>
+      </w:pPr>
+      <w:rPr>
+        <w:rFonts w:ascii="Courier New" w:hAnsi="Courier New" w:cs="Courier New" w:hint="default"/>
+      </w:rPr>
+    </w:lvl>
+    <w:lvl w:ilvl="8" w:tplc="0C090005" w:tentative="1">
+      <w:start w:val="1"/>
+      <w:numFmt w:val="bullet"/>
+      <w:lvlText w:val=""/>
+      <w:lvlJc w:val="left"/>
+      <w:pPr>
+        <w:ind w:left="6480" w:hanging="360"/>
+      </w:pPr>
+      <w:rPr>
+        <w:rFonts w:ascii="Wingdings" w:hAnsi="Wingdings" w:hint="default"/>
+      </w:rPr>
+    </w:lvl>
+  </w:abstractNum>
+  <w:abstractNum w:abstractNumId="11" w15:restartNumberingAfterBreak="0">
     <w:nsid w:val="7CFF0DAE"/>
     <w:multiLevelType w:val="multilevel"/>
     <w:tmpl w:val="E9865D46"/>
@@ -3211,7 +3957,7 @@
       </w:rPr>
     </w:lvl>
   </w:abstractNum>
-  <w:abstractNum w:abstractNumId="10" w15:restartNumberingAfterBreak="0">
+  <w:abstractNum w:abstractNumId="12" w15:restartNumberingAfterBreak="0">
     <w:nsid w:val="7D630458"/>
     <w:multiLevelType w:val="multilevel"/>
     <w:tmpl w:val="CAA84226"/>
@@ -3360,7 +4106,7 @@
       </w:rPr>
     </w:lvl>
   </w:abstractNum>
-  <w:abstractNum w:abstractNumId="11" w15:restartNumberingAfterBreak="0">
+  <w:abstractNum w:abstractNumId="13" w15:restartNumberingAfterBreak="0">
     <w:nsid w:val="7F1B09CF"/>
     <w:multiLevelType w:val="multilevel"/>
     <w:tmpl w:val="EE503BE8"/>
@@ -3509,7 +4255,7 @@
       </w:rPr>
     </w:lvl>
   </w:abstractNum>
-  <w:abstractNum w:abstractNumId="12" w15:restartNumberingAfterBreak="0">
+  <w:abstractNum w:abstractNumId="14" w15:restartNumberingAfterBreak="0">
     <w:nsid w:val="7FDF740B"/>
     <w:multiLevelType w:val="multilevel"/>
     <w:tmpl w:val="1C040834"/>
@@ -3659,42 +4405,48 @@
     </w:lvl>
   </w:abstractNum>
   <w:num w:numId="1" w16cid:durableId="1467047595">
-    <w:abstractNumId w:val="2"/>
+    <w:abstractNumId w:val="3"/>
   </w:num>
   <w:num w:numId="2" w16cid:durableId="1694189657">
-    <w:abstractNumId w:val="5"/>
+    <w:abstractNumId w:val="6"/>
   </w:num>
   <w:num w:numId="3" w16cid:durableId="1925069259">
-    <w:abstractNumId w:val="3"/>
+    <w:abstractNumId w:val="4"/>
   </w:num>
   <w:num w:numId="4" w16cid:durableId="1608582718">
-    <w:abstractNumId w:val="6"/>
+    <w:abstractNumId w:val="7"/>
   </w:num>
   <w:num w:numId="5" w16cid:durableId="67465304">
-    <w:abstractNumId w:val="7"/>
+    <w:abstractNumId w:val="8"/>
   </w:num>
   <w:num w:numId="6" w16cid:durableId="1437167741">
-    <w:abstractNumId w:val="9"/>
+    <w:abstractNumId w:val="11"/>
   </w:num>
   <w:num w:numId="7" w16cid:durableId="70859093">
-    <w:abstractNumId w:val="4"/>
+    <w:abstractNumId w:val="5"/>
   </w:num>
   <w:num w:numId="8" w16cid:durableId="1585601565">
     <w:abstractNumId w:val="0"/>
   </w:num>
   <w:num w:numId="9" w16cid:durableId="1430540130">
-    <w:abstractNumId w:val="11"/>
+    <w:abstractNumId w:val="13"/>
   </w:num>
   <w:num w:numId="10" w16cid:durableId="1069423928">
-    <w:abstractNumId w:val="8"/>
+    <w:abstractNumId w:val="9"/>
   </w:num>
   <w:num w:numId="11" w16cid:durableId="155614167">
+    <w:abstractNumId w:val="14"/>
+  </w:num>
+  <w:num w:numId="12" w16cid:durableId="46493712">
     <w:abstractNumId w:val="12"/>
   </w:num>
-  <w:num w:numId="12" w16cid:durableId="46493712">
+  <w:num w:numId="13" w16cid:durableId="171070051">
+    <w:abstractNumId w:val="2"/>
+  </w:num>
+  <w:num w:numId="14" w16cid:durableId="1240166874">
     <w:abstractNumId w:val="10"/>
   </w:num>
-  <w:num w:numId="13" w16cid:durableId="171070051">
+  <w:num w:numId="15" w16cid:durableId="1445035579">
     <w:abstractNumId w:val="1"/>
   </w:num>
 </w:numbering>
@@ -4164,7 +4916,6 @@
   <w:style w:type="character" w:default="1" w:styleId="DefaultParagraphFont">
     <w:name w:val="Default Paragraph Font"/>
     <w:uiPriority w:val="1"/>
-    <w:semiHidden/>
     <w:unhideWhenUsed/>
   </w:style>
   <w:style w:type="table" w:default="1" w:styleId="TableNormal">
@@ -4256,6 +5007,18 @@
     <w:rPr>
       <w:color w:val="605E5C"/>
       <w:shd w:val="clear" w:color="auto" w:fill="E1DFDD"/>
+    </w:rPr>
+  </w:style>
+  <w:style w:type="character" w:styleId="FollowedHyperlink">
+    <w:name w:val="FollowedHyperlink"/>
+    <w:basedOn w:val="DefaultParagraphFont"/>
+    <w:uiPriority w:val="99"/>
+    <w:semiHidden/>
+    <w:unhideWhenUsed/>
+    <w:rsid w:val="005875C9"/>
+    <w:rPr>
+      <w:color w:val="96607D" w:themeColor="followedHyperlink"/>
+      <w:u w:val="single"/>
     </w:rPr>
   </w:style>
 </w:styles>

</xml_diff>